<commit_message>
Extract and organize legal documents
Unzips all provided archive files, extracts their contents, and organizes them into the training_data directory for further processing.

Replit-Commit-Author: Agent
Replit-Commit-Session-Id: d013f953-ca21-468f-8bf2-52b2e13a6d38
Replit-Commit-Checkpoint-Type: intermediate_checkpoint
Replit-Commit-Event-Id: 88dec1af-5dbc-4ac9-9280-de3cb2347aef
Replit-Commit-Screenshot-Url: https://storage.googleapis.com/screenshot-production-us-central1/08db6339-46a6-4e1f-bd99-7431b7132adf/d013f953-ca21-468f-8bf2-52b2e13a6d38/V0COG9t
Replit-Helium-Checkpoint-Created: true
</commit_message>
<xml_diff>
--- a/training_data/documents/Commercial Court-20251101T191702Z-1-001/Commercial Court/Teena knit garments/Proof Affidavit.docx
+++ b/training_data/documents/Commercial Court-20251101T191702Z-1-001/Commercial Court/Teena knit garments/Proof Affidavit.docx
@@ -1,6 +1,6 @@
 
 <file path=word/document.xml><?xml version="1.0" encoding="utf-8"?>
-<w:document xmlns:wpc="http://schemas.microsoft.com/office/word/2010/wordprocessingCanvas" xmlns:cx="http://schemas.microsoft.com/office/drawing/2014/chartex" xmlns:cx1="http://schemas.microsoft.com/office/drawing/2015/9/8/chartex" xmlns:cx2="http://schemas.microsoft.com/office/drawing/2015/10/21/chartex" xmlns:cx3="http://schemas.microsoft.com/office/drawing/2016/5/9/chartex" xmlns:cx4="http://schemas.microsoft.com/office/drawing/2016/5/10/chartex" xmlns:cx5="http://schemas.microsoft.com/office/drawing/2016/5/11/chartex" xmlns:cx6="http://schemas.microsoft.com/office/drawing/2016/5/12/chartex" xmlns:cx7="http://schemas.microsoft.com/office/drawing/2016/5/13/chartex" xmlns:cx8="http://schemas.microsoft.com/office/drawing/2016/5/14/chartex" xmlns:mc="http://schemas.openxmlformats.org/markup-compatibility/2006" xmlns:aink="http://schemas.microsoft.com/office/drawing/2016/ink" xmlns:am3d="http://schemas.microsoft.com/office/drawing/2017/model3d" xmlns:o="urn:schemas-microsoft-com:office:office" xmlns:oel="http://schemas.microsoft.com/office/2019/extlst" xmlns:r="http://schemas.openxmlformats.org/officeDocument/2006/relationships" xmlns:m="http://schemas.openxmlformats.org/officeDocument/2006/math" xmlns:v="urn:schemas-microsoft-com:vml" xmlns:wp14="http://schemas.microsoft.com/office/word/2010/wordprocessingDrawing" xmlns:wp="http://schemas.openxmlformats.org/drawingml/2006/wordprocessingDrawing" xmlns:w10="urn:schemas-microsoft-com:office:word" xmlns:w="http://schemas.openxmlformats.org/wordprocessingml/2006/main" xmlns:w14="http://schemas.microsoft.com/office/word/2010/wordml" xmlns:w15="http://schemas.microsoft.com/office/word/2012/wordml" xmlns:w16cex="http://schemas.microsoft.com/office/word/2018/wordml/cex" xmlns:w16cid="http://schemas.microsoft.com/office/word/2016/wordml/cid" xmlns:w16="http://schemas.microsoft.com/office/word/2018/wordml" xmlns:w16du="http://schemas.microsoft.com/office/word/2023/wordml/word16du" xmlns:w16sdtdh="http://schemas.microsoft.com/office/word/2020/wordml/sdtdatahash" xmlns:w16se="http://schemas.microsoft.com/office/word/2015/wordml/symex" xmlns:wpg="http://schemas.microsoft.com/office/word/2010/wordprocessingGroup" xmlns:wpi="http://schemas.microsoft.com/office/word/2010/wordprocessingInk" xmlns:wne="http://schemas.microsoft.com/office/word/2006/wordml" xmlns:wps="http://schemas.microsoft.com/office/word/2010/wordprocessingShape" mc:Ignorable="w14 w15 w16se w16cid w16 w16cex w16sdtdh w16du wp14">
+<w:document xmlns:wpc="http://schemas.microsoft.com/office/word/2010/wordprocessingCanvas" xmlns:mc="http://schemas.openxmlformats.org/markup-compatibility/2006" xmlns:o="urn:schemas-microsoft-com:office:office" xmlns:r="http://schemas.openxmlformats.org/officeDocument/2006/relationships" xmlns:m="http://schemas.openxmlformats.org/officeDocument/2006/math" xmlns:v="urn:schemas-microsoft-com:vml" xmlns:wp14="http://schemas.microsoft.com/office/word/2010/wordprocessingDrawing" xmlns:wp="http://schemas.openxmlformats.org/drawingml/2006/wordprocessingDrawing" xmlns:w10="urn:schemas-microsoft-com:office:word" xmlns:w="http://schemas.openxmlformats.org/wordprocessingml/2006/main" xmlns:w14="http://schemas.microsoft.com/office/word/2010/wordml" xmlns:wpg="http://schemas.microsoft.com/office/word/2010/wordprocessingGroup" xmlns:wpi="http://schemas.microsoft.com/office/word/2010/wordprocessingInk" xmlns:wne="http://schemas.microsoft.com/office/word/2006/wordml" xmlns:wps="http://schemas.microsoft.com/office/word/2010/wordprocessingShape" mc:Ignorable="w14 wp14">
   <w:body>
     <w:p>
       <w:pPr>
@@ -140,8 +140,33 @@
           <w:rFonts w:ascii="Arial" w:hAnsi="Arial" w:cs="Arial"/>
           <w:szCs w:val="24"/>
         </w:rPr>
-        <w:t>M/s. Teena Knit Garments,</w:t>
-      </w:r>
+        <w:t xml:space="preserve">M/s. </w:t>
+      </w:r>
+      <w:proofErr w:type="spellStart"/>
+      <w:r>
+        <w:rPr>
+          <w:rFonts w:ascii="Arial" w:hAnsi="Arial" w:cs="Arial"/>
+          <w:szCs w:val="24"/>
+        </w:rPr>
+        <w:t>Teena</w:t>
+      </w:r>
+      <w:proofErr w:type="spellEnd"/>
+      <w:r>
+        <w:rPr>
+          <w:rFonts w:ascii="Arial" w:hAnsi="Arial" w:cs="Arial"/>
+          <w:szCs w:val="24"/>
+        </w:rPr>
+        <w:t xml:space="preserve"> Knit Garments</w:t>
+      </w:r>
+      <w:proofErr w:type="gramStart"/>
+      <w:r>
+        <w:rPr>
+          <w:rFonts w:ascii="Arial" w:hAnsi="Arial" w:cs="Arial"/>
+          <w:szCs w:val="24"/>
+        </w:rPr>
+        <w:t>,</w:t>
+      </w:r>
+      <w:proofErr w:type="gramEnd"/>
       <w:r>
         <w:rPr>
           <w:rFonts w:ascii="Arial" w:hAnsi="Arial" w:cs="Arial"/>
@@ -156,7 +181,23 @@
           <w:szCs w:val="24"/>
         </w:rPr>
         <w:br/>
-        <w:t>No.461/2, 3 Abirami Nagar,</w:t>
+        <w:t xml:space="preserve">No.461/2, 3 </w:t>
+      </w:r>
+      <w:proofErr w:type="spellStart"/>
+      <w:r>
+        <w:rPr>
+          <w:rFonts w:ascii="Arial" w:hAnsi="Arial" w:cs="Arial"/>
+          <w:szCs w:val="24"/>
+        </w:rPr>
+        <w:t>Abirami</w:t>
+      </w:r>
+      <w:proofErr w:type="spellEnd"/>
+      <w:r>
+        <w:rPr>
+          <w:rFonts w:ascii="Arial" w:hAnsi="Arial" w:cs="Arial"/>
+          <w:szCs w:val="24"/>
+        </w:rPr>
+        <w:t xml:space="preserve"> Nagar,</w:t>
       </w:r>
       <w:r>
         <w:rPr>
@@ -164,7 +205,22 @@
           <w:szCs w:val="24"/>
         </w:rPr>
         <w:br/>
-        <w:t xml:space="preserve">Gandhinagar (PO) </w:t>
+      </w:r>
+      <w:proofErr w:type="spellStart"/>
+      <w:r>
+        <w:rPr>
+          <w:rFonts w:ascii="Arial" w:hAnsi="Arial" w:cs="Arial"/>
+          <w:szCs w:val="24"/>
+        </w:rPr>
+        <w:t>Gandhinagar</w:t>
+      </w:r>
+      <w:proofErr w:type="spellEnd"/>
+      <w:r>
+        <w:rPr>
+          <w:rFonts w:ascii="Arial" w:hAnsi="Arial" w:cs="Arial"/>
+          <w:szCs w:val="24"/>
+        </w:rPr>
+        <w:t xml:space="preserve"> (PO) </w:t>
       </w:r>
       <w:r>
         <w:rPr>
@@ -172,7 +228,22 @@
           <w:szCs w:val="24"/>
         </w:rPr>
         <w:br/>
-        <w:t>Tirupur – 641 603</w:t>
+      </w:r>
+      <w:proofErr w:type="spellStart"/>
+      <w:r>
+        <w:rPr>
+          <w:rFonts w:ascii="Arial" w:hAnsi="Arial" w:cs="Arial"/>
+          <w:szCs w:val="24"/>
+        </w:rPr>
+        <w:t>Tirupur</w:t>
+      </w:r>
+      <w:proofErr w:type="spellEnd"/>
+      <w:r>
+        <w:rPr>
+          <w:rFonts w:ascii="Arial" w:hAnsi="Arial" w:cs="Arial"/>
+          <w:szCs w:val="24"/>
+        </w:rPr>
+        <w:t xml:space="preserve"> – 641 603</w:t>
       </w:r>
       <w:r>
         <w:rPr>
@@ -252,7 +323,6 @@
         </w:rPr>
         <w:tab/>
       </w:r>
-      <w:proofErr w:type="gramStart"/>
       <w:r>
         <w:rPr>
           <w:rFonts w:ascii="Arial" w:hAnsi="Arial" w:cs="Arial"/>
@@ -269,7 +339,6 @@
         </w:rPr>
         <w:t>::</w:t>
       </w:r>
-      <w:proofErr w:type="gramEnd"/>
       <w:r>
         <w:rPr>
           <w:rFonts w:ascii="Arial" w:hAnsi="Arial" w:cs="Arial"/>
@@ -490,6 +559,22 @@
         </w:rPr>
         <w:tab/>
       </w:r>
+      <w:r>
+        <w:rPr>
+          <w:rFonts w:ascii="Arial" w:hAnsi="Arial" w:cs="Arial"/>
+          <w:bCs/>
+          <w:szCs w:val="24"/>
+        </w:rPr>
+        <w:tab/>
+      </w:r>
+      <w:r>
+        <w:rPr>
+          <w:rFonts w:ascii="Arial" w:hAnsi="Arial" w:cs="Arial"/>
+          <w:bCs/>
+          <w:szCs w:val="24"/>
+        </w:rPr>
+        <w:t>:</w:t>
+      </w:r>
       <w:proofErr w:type="gramStart"/>
       <w:r>
         <w:rPr>
@@ -497,7 +582,7 @@
           <w:bCs/>
           <w:szCs w:val="24"/>
         </w:rPr>
-        <w:tab/>
+        <w:t xml:space="preserve">: </w:t>
       </w:r>
       <w:r>
         <w:rPr>
@@ -505,7 +590,7 @@
           <w:bCs/>
           <w:szCs w:val="24"/>
         </w:rPr>
-        <w:t>::</w:t>
+        <w:t xml:space="preserve"> Defendant</w:t>
       </w:r>
       <w:proofErr w:type="gramEnd"/>
       <w:r>
@@ -514,15 +599,7 @@
           <w:bCs/>
           <w:szCs w:val="24"/>
         </w:rPr>
-        <w:t xml:space="preserve"> </w:t>
-      </w:r>
-      <w:r>
-        <w:rPr>
-          <w:rFonts w:ascii="Arial" w:hAnsi="Arial" w:cs="Arial"/>
-          <w:bCs/>
-          <w:szCs w:val="24"/>
-        </w:rPr>
-        <w:t xml:space="preserve"> Defendant  </w:t>
+        <w:t xml:space="preserve">  </w:t>
       </w:r>
     </w:p>
     <w:p>
@@ -555,6 +632,8 @@
         </w:rPr>
         <w:t>PROOF AFFIDAVIT</w:t>
       </w:r>
+      <w:bookmarkStart w:id="0" w:name="_GoBack"/>
+      <w:bookmarkEnd w:id="0"/>
     </w:p>
     <w:p>
       <w:pPr>
@@ -574,7 +653,6 @@
         <w:t xml:space="preserve">I, </w:t>
       </w:r>
       <w:proofErr w:type="spellStart"/>
-      <w:proofErr w:type="gramStart"/>
       <w:r>
         <w:rPr>
           <w:rFonts w:ascii="Arial" w:hAnsi="Arial" w:cs="Arial"/>
@@ -583,7 +661,6 @@
         <w:t>Mr.Chandrasekaran</w:t>
       </w:r>
       <w:proofErr w:type="spellEnd"/>
-      <w:proofErr w:type="gramEnd"/>
       <w:r>
         <w:rPr>
           <w:rFonts w:ascii="Arial" w:hAnsi="Arial" w:cs="Arial"/>
@@ -606,13 +683,6 @@
           <w:szCs w:val="24"/>
         </w:rPr>
         <w:t xml:space="preserve">, </w:t>
-      </w:r>
-      <w:r>
-        <w:rPr>
-          <w:rFonts w:ascii="Arial" w:hAnsi="Arial" w:cs="Arial"/>
-          <w:szCs w:val="24"/>
-        </w:rPr>
-        <w:t xml:space="preserve">aged 52 years, </w:t>
       </w:r>
       <w:r>
         <w:rPr>
@@ -721,39 +791,7 @@
           <w:sz w:val="24"/>
           <w:szCs w:val="24"/>
         </w:rPr>
-        <w:t>I am the deponent herein and the</w:t>
-      </w:r>
-      <w:r>
-        <w:rPr>
-          <w:rFonts w:ascii="Arial" w:hAnsi="Arial" w:cs="Arial"/>
-          <w:sz w:val="24"/>
-          <w:szCs w:val="24"/>
-        </w:rPr>
-        <w:t xml:space="preserve"> partner of</w:t>
-      </w:r>
-      <w:r>
-        <w:rPr>
-          <w:rFonts w:ascii="Arial" w:hAnsi="Arial" w:cs="Arial"/>
-          <w:sz w:val="24"/>
-          <w:szCs w:val="24"/>
-        </w:rPr>
-        <w:t xml:space="preserve"> plaintiff </w:t>
-      </w:r>
-      <w:r>
-        <w:rPr>
-          <w:rFonts w:ascii="Arial" w:hAnsi="Arial" w:cs="Arial"/>
-          <w:sz w:val="24"/>
-          <w:szCs w:val="24"/>
-        </w:rPr>
-        <w:t xml:space="preserve">firm </w:t>
-      </w:r>
-      <w:r>
-        <w:rPr>
-          <w:rFonts w:ascii="Arial" w:hAnsi="Arial" w:cs="Arial"/>
-          <w:sz w:val="24"/>
-          <w:szCs w:val="24"/>
-        </w:rPr>
-        <w:t>in the above suit.</w:t>
+        <w:t>I am the deponent herein and the plaintiff in the above suit.</w:t>
       </w:r>
     </w:p>
     <w:p>
@@ -792,88 +830,7 @@
           <w:sz w:val="24"/>
           <w:szCs w:val="24"/>
         </w:rPr>
-        <w:t>I submit that I have filed the above suit for the relief of recovery of a sum of Rs.</w:t>
-      </w:r>
-      <w:r>
-        <w:rPr>
-          <w:rFonts w:ascii="Arial" w:eastAsia="Times New Roman" w:hAnsi="Arial" w:cs="Arial"/>
-          <w:bCs/>
-          <w:sz w:val="24"/>
-          <w:szCs w:val="24"/>
-        </w:rPr>
-        <w:t>6</w:t>
-      </w:r>
-      <w:r>
-        <w:rPr>
-          <w:rFonts w:ascii="Arial" w:eastAsia="Times New Roman" w:hAnsi="Arial" w:cs="Arial"/>
-          <w:bCs/>
-          <w:sz w:val="24"/>
-          <w:szCs w:val="24"/>
-        </w:rPr>
-        <w:t>,</w:t>
-      </w:r>
-      <w:r>
-        <w:rPr>
-          <w:rFonts w:ascii="Arial" w:eastAsia="Times New Roman" w:hAnsi="Arial" w:cs="Arial"/>
-          <w:bCs/>
-          <w:sz w:val="24"/>
-          <w:szCs w:val="24"/>
-        </w:rPr>
-        <w:t>96</w:t>
-      </w:r>
-      <w:r>
-        <w:rPr>
-          <w:rFonts w:ascii="Arial" w:eastAsia="Times New Roman" w:hAnsi="Arial" w:cs="Arial"/>
-          <w:bCs/>
-          <w:sz w:val="24"/>
-          <w:szCs w:val="24"/>
-        </w:rPr>
-        <w:t>,</w:t>
-      </w:r>
-      <w:r>
-        <w:rPr>
-          <w:rFonts w:ascii="Arial" w:eastAsia="Times New Roman" w:hAnsi="Arial" w:cs="Arial"/>
-          <w:bCs/>
-          <w:sz w:val="24"/>
-          <w:szCs w:val="24"/>
-        </w:rPr>
-        <w:t>711.15</w:t>
-      </w:r>
-      <w:r>
-        <w:rPr>
-          <w:rFonts w:ascii="Arial" w:eastAsia="Times New Roman" w:hAnsi="Arial" w:cs="Arial"/>
-          <w:bCs/>
-          <w:sz w:val="24"/>
-          <w:szCs w:val="24"/>
-        </w:rPr>
-        <w:t>/-</w:t>
-      </w:r>
-      <w:r>
-        <w:rPr>
-          <w:rFonts w:ascii="Arial" w:eastAsia="Times New Roman" w:hAnsi="Arial" w:cs="Arial"/>
-          <w:bCs/>
-          <w:sz w:val="24"/>
-          <w:szCs w:val="24"/>
-        </w:rPr>
-        <w:t xml:space="preserve"> along with interest at 1</w:t>
-      </w:r>
-      <w:r>
-        <w:rPr>
-          <w:rFonts w:ascii="Arial" w:eastAsia="Times New Roman" w:hAnsi="Arial" w:cs="Arial"/>
-          <w:bCs/>
-          <w:sz w:val="24"/>
-          <w:szCs w:val="24"/>
-        </w:rPr>
-        <w:t>2</w:t>
-      </w:r>
-      <w:r>
-        <w:rPr>
-          <w:rFonts w:ascii="Arial" w:eastAsia="Times New Roman" w:hAnsi="Arial" w:cs="Arial"/>
-          <w:bCs/>
-          <w:sz w:val="24"/>
-          <w:szCs w:val="24"/>
-        </w:rPr>
-        <w:t>% per annum and for other reliefs.</w:t>
+        <w:t>I submit that I have filed the above suit for the relief of recovery of a sum of Rs.10,06,967.12/- along with interest at 18% per annum and for other reliefs.</w:t>
       </w:r>
     </w:p>
     <w:p>
@@ -936,25 +893,7 @@
           <w:sz w:val="24"/>
           <w:szCs w:val="24"/>
         </w:rPr>
-        <w:t xml:space="preserve"> of M/</w:t>
-      </w:r>
-      <w:proofErr w:type="spellStart"/>
-      <w:r>
-        <w:rPr>
-          <w:rFonts w:ascii="Arial" w:hAnsi="Arial" w:cs="Arial"/>
-          <w:sz w:val="24"/>
-          <w:szCs w:val="24"/>
-        </w:rPr>
-        <w:t>s.Teena</w:t>
-      </w:r>
-      <w:proofErr w:type="spellEnd"/>
-      <w:r>
-        <w:rPr>
-          <w:rFonts w:ascii="Arial" w:hAnsi="Arial" w:cs="Arial"/>
-          <w:sz w:val="24"/>
-          <w:szCs w:val="24"/>
-        </w:rPr>
-        <w:t xml:space="preserve"> Knit Garments, have been engaged in the business of manufacturing and selling garments for men and women to customers across the country. During the course of this business, the defendant company became one of the plaintiff’s customers, purchasing various garments. The transactions between the plaintiff and the defendant were based on Purchase Orders issued by the defendant, upon which the plaintiff would supply the products and raise corresponding invoices. Payments for these invoices were made on a credit basis.  </w:t>
+        <w:t xml:space="preserve"> of M/s. Teena Knit Garments, have been engaged in the business of manufacturing and selling garments for men and women to customers across the country. During the course of this business, the defendant company became one of the plaintiff’s customers, purchasing various garments. The transactions between the plaintiff and the defendant were based on Purchase Orders issued by the defendant, upon which the plaintiff would supply the products and raise corresponding invoices. Payments for these invoices were made on a credit basis.  </w:t>
       </w:r>
     </w:p>
     <w:p>
@@ -7087,7 +7026,6 @@
                 <w:sz w:val="24"/>
                 <w:szCs w:val="24"/>
               </w:rPr>
-              <w:lastRenderedPageBreak/>
               <w:t>29.</w:t>
             </w:r>
           </w:p>
@@ -8689,31 +8627,7 @@
           <w:sz w:val="24"/>
           <w:szCs w:val="24"/>
         </w:rPr>
-        <w:t xml:space="preserve">but despite plaintiff’s numerous requests, the defendant continually delayed payment under various pretexts. </w:t>
-      </w:r>
-      <w:r>
-        <w:rPr>
-          <w:rFonts w:ascii="Arial" w:hAnsi="Arial" w:cs="Arial"/>
-          <w:sz w:val="24"/>
-          <w:szCs w:val="24"/>
-        </w:rPr>
-        <w:t>I submit that on the strength of the assurance given by the defendant, I was having transactions with the defendant despite pending outstanding. However, the defendant still not having cleared the outstanding, I had stopped transactions with defendant thereafter</w:t>
-      </w:r>
-      <w:r>
-        <w:rPr>
-          <w:rFonts w:ascii="Arial" w:hAnsi="Arial" w:cs="Arial"/>
-          <w:sz w:val="24"/>
-          <w:szCs w:val="24"/>
-        </w:rPr>
-        <w:t xml:space="preserve">. </w:t>
-      </w:r>
-      <w:r>
-        <w:rPr>
-          <w:rFonts w:ascii="Arial" w:hAnsi="Arial" w:cs="Arial"/>
-          <w:sz w:val="24"/>
-          <w:szCs w:val="24"/>
-        </w:rPr>
-        <w:t>Thus, the plaintiff having left with no other option, issued a legal notice dated 06.02.2024 to the defendant, demanding payment of outstanding. However, even after receiving the notice, the defendant neither replied nor paid the outstanding amount.</w:t>
+        <w:t>but despite plaintiff’s numerous requests, the defendant continually delayed payment under various pretexts. Thus, the plaintiff having left with no other option, issued a legal notice dated 06.02.2024 to the defendant, demanding payment of outstanding. However, even after receiving the notice, the defendant neither replied nor paid the outstanding amount.</w:t>
       </w:r>
     </w:p>
     <w:p>
@@ -8763,90 +8677,7 @@
           <w:sz w:val="24"/>
           <w:szCs w:val="24"/>
         </w:rPr>
-        <w:t xml:space="preserve">I humbly submit </w:t>
-      </w:r>
-      <w:r>
-        <w:rPr>
-          <w:rFonts w:ascii="Arial" w:hAnsi="Arial" w:cs="Arial"/>
-          <w:sz w:val="24"/>
-          <w:szCs w:val="24"/>
-        </w:rPr>
-        <w:t xml:space="preserve">that the defendant has unjustifiably withheld the outstanding amount and is liable to pay interest at 24% per annum according to trade usage, </w:t>
-      </w:r>
-      <w:r>
-        <w:rPr>
-          <w:rFonts w:ascii="Arial" w:hAnsi="Arial" w:cs="Arial"/>
-          <w:sz w:val="24"/>
-          <w:szCs w:val="24"/>
-        </w:rPr>
-        <w:lastRenderedPageBreak/>
-        <w:t xml:space="preserve">custom, and agreements. However, the plaintiff limits its claim to 12% per annum. The plaintiff asserts that the defendant, fully aware of their liability, is intentionally avoiding payment for the delivered products. </w:t>
-      </w:r>
-      <w:r>
-        <w:rPr>
-          <w:rFonts w:ascii="Arial" w:hAnsi="Arial" w:cs="Arial"/>
-          <w:sz w:val="24"/>
-          <w:szCs w:val="24"/>
-        </w:rPr>
-        <w:t>I</w:t>
-      </w:r>
-      <w:r>
-        <w:rPr>
-          <w:rFonts w:ascii="Arial" w:hAnsi="Arial" w:cs="Arial"/>
-          <w:sz w:val="24"/>
-          <w:szCs w:val="24"/>
-        </w:rPr>
-        <w:t xml:space="preserve"> further </w:t>
-      </w:r>
-      <w:proofErr w:type="gramStart"/>
-      <w:r>
-        <w:rPr>
-          <w:rFonts w:ascii="Arial" w:hAnsi="Arial" w:cs="Arial"/>
-          <w:sz w:val="24"/>
-          <w:szCs w:val="24"/>
-        </w:rPr>
-        <w:t>submits</w:t>
-      </w:r>
-      <w:proofErr w:type="gramEnd"/>
-      <w:r>
-        <w:rPr>
-          <w:rFonts w:ascii="Arial" w:hAnsi="Arial" w:cs="Arial"/>
-          <w:sz w:val="24"/>
-          <w:szCs w:val="24"/>
-        </w:rPr>
-        <w:t xml:space="preserve"> that </w:t>
-      </w:r>
-      <w:r>
-        <w:rPr>
-          <w:rFonts w:ascii="Arial" w:hAnsi="Arial" w:cs="Arial"/>
-          <w:sz w:val="24"/>
-          <w:szCs w:val="24"/>
-        </w:rPr>
-        <w:t>the plaintiff firm has</w:t>
-      </w:r>
-      <w:r>
-        <w:rPr>
-          <w:rFonts w:ascii="Arial" w:hAnsi="Arial" w:cs="Arial"/>
-          <w:sz w:val="24"/>
-          <w:szCs w:val="24"/>
-        </w:rPr>
-        <w:t xml:space="preserve"> initiated Pre-Institution Mediation under section 12A (1) of The Commercial Courts Act, 2015 in PIM No.204/2024 and the same was closed on 04.09.2024 as “non-starter” for the reasons stating that the respondent was absent and there was no chance for settlement. Thus, </w:t>
-      </w:r>
-      <w:r>
-        <w:rPr>
-          <w:rFonts w:ascii="Arial" w:hAnsi="Arial" w:cs="Arial"/>
-          <w:sz w:val="24"/>
-          <w:szCs w:val="24"/>
-        </w:rPr>
-        <w:t xml:space="preserve">I have </w:t>
-      </w:r>
-      <w:r>
-        <w:rPr>
-          <w:rFonts w:ascii="Arial" w:hAnsi="Arial" w:cs="Arial"/>
-          <w:sz w:val="24"/>
-          <w:szCs w:val="24"/>
-        </w:rPr>
-        <w:t>become constrained to file the present suit seeking for recovery of outstanding money payable by the defendant to them. Hence, the suit.</w:t>
+        <w:t xml:space="preserve">I humbly submit that the defendant has unjustifiably withheld the outstanding amount and is liable to pay interest at 24% per annum according to trade usage, custom, and agreements. However, the plaintiff limits his claim to 18% per annum. The plaintiff asserts that the defendant, fully aware of their liability, is intentionally avoiding payment for the delivered products. Thus, I have become constrained to file the present suit seeking for recovery of outstanding money payable by the defendant to him. Hence, the suit. </w:t>
       </w:r>
     </w:p>
     <w:p>
@@ -8870,8 +8701,8 @@
         <w:jc w:val="both"/>
         <w:rPr>
           <w:rFonts w:ascii="Arial" w:hAnsi="Arial" w:cs="Arial"/>
-          <w:sz w:val="8"/>
-          <w:szCs w:val="36"/>
+          <w:sz w:val="2"/>
+          <w:szCs w:val="24"/>
         </w:rPr>
       </w:pPr>
     </w:p>
@@ -9036,7 +8867,7 @@
           <w:szCs w:val="24"/>
           <w:lang w:val="en-IN"/>
         </w:rPr>
-        <w:t>DEPONENT</w:t>
+        <w:t>PETITIONER</w:t>
       </w:r>
       <w:r>
         <w:rPr>
@@ -9148,7 +8979,6 @@
           <w:szCs w:val="24"/>
           <w:u w:val="single"/>
         </w:rPr>
-        <w:lastRenderedPageBreak/>
         <w:t xml:space="preserve">IN THE COURT OF THE HONOURABLE COMMERCIAL DISTRICT JUDGE </w:t>
       </w:r>
     </w:p>
@@ -9259,8 +9089,33 @@
           <w:rFonts w:ascii="Arial" w:hAnsi="Arial" w:cs="Arial"/>
           <w:szCs w:val="24"/>
         </w:rPr>
-        <w:t>M/s. Teena Knit Garments,</w:t>
-      </w:r>
+        <w:t xml:space="preserve">M/s. </w:t>
+      </w:r>
+      <w:proofErr w:type="spellStart"/>
+      <w:r>
+        <w:rPr>
+          <w:rFonts w:ascii="Arial" w:hAnsi="Arial" w:cs="Arial"/>
+          <w:szCs w:val="24"/>
+        </w:rPr>
+        <w:t>Teena</w:t>
+      </w:r>
+      <w:proofErr w:type="spellEnd"/>
+      <w:r>
+        <w:rPr>
+          <w:rFonts w:ascii="Arial" w:hAnsi="Arial" w:cs="Arial"/>
+          <w:szCs w:val="24"/>
+        </w:rPr>
+        <w:t xml:space="preserve"> Knit Garments</w:t>
+      </w:r>
+      <w:proofErr w:type="gramStart"/>
+      <w:r>
+        <w:rPr>
+          <w:rFonts w:ascii="Arial" w:hAnsi="Arial" w:cs="Arial"/>
+          <w:szCs w:val="24"/>
+        </w:rPr>
+        <w:t>,</w:t>
+      </w:r>
+      <w:proofErr w:type="gramEnd"/>
       <w:r>
         <w:rPr>
           <w:rFonts w:ascii="Arial" w:hAnsi="Arial" w:cs="Arial"/>
@@ -9275,7 +9130,23 @@
           <w:szCs w:val="24"/>
         </w:rPr>
         <w:br/>
-        <w:t>No.461/2, 3 Abirami Nagar,</w:t>
+        <w:t xml:space="preserve">No.461/2, 3 </w:t>
+      </w:r>
+      <w:proofErr w:type="spellStart"/>
+      <w:r>
+        <w:rPr>
+          <w:rFonts w:ascii="Arial" w:hAnsi="Arial" w:cs="Arial"/>
+          <w:szCs w:val="24"/>
+        </w:rPr>
+        <w:t>Abirami</w:t>
+      </w:r>
+      <w:proofErr w:type="spellEnd"/>
+      <w:r>
+        <w:rPr>
+          <w:rFonts w:ascii="Arial" w:hAnsi="Arial" w:cs="Arial"/>
+          <w:szCs w:val="24"/>
+        </w:rPr>
+        <w:t xml:space="preserve"> Nagar,</w:t>
       </w:r>
       <w:r>
         <w:rPr>
@@ -9283,7 +9154,22 @@
           <w:szCs w:val="24"/>
         </w:rPr>
         <w:br/>
-        <w:t xml:space="preserve">Gandhinagar (PO) </w:t>
+      </w:r>
+      <w:proofErr w:type="spellStart"/>
+      <w:r>
+        <w:rPr>
+          <w:rFonts w:ascii="Arial" w:hAnsi="Arial" w:cs="Arial"/>
+          <w:szCs w:val="24"/>
+        </w:rPr>
+        <w:t>Gandhinagar</w:t>
+      </w:r>
+      <w:proofErr w:type="spellEnd"/>
+      <w:r>
+        <w:rPr>
+          <w:rFonts w:ascii="Arial" w:hAnsi="Arial" w:cs="Arial"/>
+          <w:szCs w:val="24"/>
+        </w:rPr>
+        <w:t xml:space="preserve"> (PO) </w:t>
       </w:r>
       <w:r>
         <w:rPr>
@@ -9291,7 +9177,22 @@
           <w:szCs w:val="24"/>
         </w:rPr>
         <w:br/>
-        <w:t>Tirupur – 641 603</w:t>
+      </w:r>
+      <w:proofErr w:type="spellStart"/>
+      <w:r>
+        <w:rPr>
+          <w:rFonts w:ascii="Arial" w:hAnsi="Arial" w:cs="Arial"/>
+          <w:szCs w:val="24"/>
+        </w:rPr>
+        <w:t>Tirupur</w:t>
+      </w:r>
+      <w:proofErr w:type="spellEnd"/>
+      <w:r>
+        <w:rPr>
+          <w:rFonts w:ascii="Arial" w:hAnsi="Arial" w:cs="Arial"/>
+          <w:szCs w:val="24"/>
+        </w:rPr>
+        <w:t xml:space="preserve"> – 641 603</w:t>
       </w:r>
       <w:r>
         <w:rPr>
@@ -9347,7 +9248,6 @@
         </w:rPr>
         <w:tab/>
       </w:r>
-      <w:proofErr w:type="gramStart"/>
       <w:r>
         <w:rPr>
           <w:rFonts w:ascii="Arial" w:hAnsi="Arial" w:cs="Arial"/>
@@ -9357,7 +9257,6 @@
         <w:tab/>
         <w:t>::</w:t>
       </w:r>
-      <w:proofErr w:type="gramEnd"/>
       <w:r>
         <w:rPr>
           <w:rFonts w:ascii="Arial" w:hAnsi="Arial" w:cs="Arial"/>
@@ -9551,6 +9450,7 @@
         </w:rPr>
         <w:t>Represented by its Managing Director</w:t>
       </w:r>
+      <w:proofErr w:type="gramStart"/>
       <w:r>
         <w:rPr>
           <w:rFonts w:ascii="Arial" w:hAnsi="Arial" w:cs="Arial"/>
@@ -9559,7 +9459,6 @@
         </w:rPr>
         <w:tab/>
       </w:r>
-      <w:proofErr w:type="gramStart"/>
       <w:r>
         <w:rPr>
           <w:rFonts w:ascii="Arial" w:hAnsi="Arial" w:cs="Arial"/>
@@ -9674,7 +9573,7 @@
     <w:p>
       <w:pPr>
         <w:spacing w:line="360" w:lineRule="auto"/>
-        <w:ind w:left="3600" w:right="-846"/>
+        <w:ind w:left="5040" w:right="-846"/>
         <w:jc w:val="center"/>
         <w:rPr>
           <w:rFonts w:ascii="Arial" w:hAnsi="Arial" w:cs="Arial"/>
@@ -9775,7 +9674,6 @@
         </w:rPr>
       </w:pPr>
       <w:proofErr w:type="spellStart"/>
-      <w:proofErr w:type="gramStart"/>
       <w:r>
         <w:rPr>
           <w:rFonts w:ascii="Arial" w:hAnsi="Arial" w:cs="Arial"/>
@@ -9786,7 +9684,6 @@
         <w:t>S.Chandrasekaran</w:t>
       </w:r>
       <w:proofErr w:type="spellEnd"/>
-      <w:proofErr w:type="gramEnd"/>
       <w:r>
         <w:rPr>
           <w:rFonts w:ascii="Arial" w:hAnsi="Arial" w:cs="Arial"/>
@@ -9794,8 +9691,19 @@
           <w:bCs/>
           <w:szCs w:val="24"/>
         </w:rPr>
-        <w:t>, M.A., B.L., DLL.,</w:t>
-      </w:r>
+        <w:t xml:space="preserve">, M.A., B.L., </w:t>
+      </w:r>
+      <w:proofErr w:type="gramStart"/>
+      <w:r>
+        <w:rPr>
+          <w:rFonts w:ascii="Arial" w:hAnsi="Arial" w:cs="Arial"/>
+          <w:b/>
+          <w:bCs/>
+          <w:szCs w:val="24"/>
+        </w:rPr>
+        <w:t>DLL.,</w:t>
+      </w:r>
+      <w:proofErr w:type="gramEnd"/>
     </w:p>
     <w:p>
       <w:pPr>
@@ -9845,7 +9753,27 @@
           <w:bCs/>
           <w:szCs w:val="24"/>
         </w:rPr>
-        <w:t xml:space="preserve"> Chandhar, B.A., LLB., (Hons)</w:t>
+        <w:t xml:space="preserve"> </w:t>
+      </w:r>
+      <w:proofErr w:type="spellStart"/>
+      <w:r>
+        <w:rPr>
+          <w:rFonts w:ascii="Arial" w:hAnsi="Arial" w:cs="Arial"/>
+          <w:b/>
+          <w:bCs/>
+          <w:szCs w:val="24"/>
+        </w:rPr>
+        <w:t>Chandhar</w:t>
+      </w:r>
+      <w:proofErr w:type="spellEnd"/>
+      <w:r>
+        <w:rPr>
+          <w:rFonts w:ascii="Arial" w:hAnsi="Arial" w:cs="Arial"/>
+          <w:b/>
+          <w:bCs/>
+          <w:szCs w:val="24"/>
+        </w:rPr>
+        <w:t>, B.A., LLB., (Hons)</w:t>
       </w:r>
     </w:p>
     <w:p>
@@ -10028,7 +9956,7 @@
       </w:pPr>
     </w:p>
     <w:sectPr>
-      <w:headerReference w:type="default" r:id="rId7"/>
+      <w:headerReference w:type="default" r:id="rId8"/>
       <w:pgSz w:w="11907" w:h="16840" w:code="9"/>
       <w:pgMar w:top="1440" w:right="1440" w:bottom="1440" w:left="1440" w:header="720" w:footer="720" w:gutter="0"/>
       <w:cols w:space="720"/>
@@ -10039,7 +9967,7 @@
 </file>
 
 <file path=word/endnotes.xml><?xml version="1.0" encoding="utf-8"?>
-<w:endnotes xmlns:wpc="http://schemas.microsoft.com/office/word/2010/wordprocessingCanvas" xmlns:cx="http://schemas.microsoft.com/office/drawing/2014/chartex" xmlns:cx1="http://schemas.microsoft.com/office/drawing/2015/9/8/chartex" xmlns:cx2="http://schemas.microsoft.com/office/drawing/2015/10/21/chartex" xmlns:cx3="http://schemas.microsoft.com/office/drawing/2016/5/9/chartex" xmlns:cx4="http://schemas.microsoft.com/office/drawing/2016/5/10/chartex" xmlns:cx5="http://schemas.microsoft.com/office/drawing/2016/5/11/chartex" xmlns:cx6="http://schemas.microsoft.com/office/drawing/2016/5/12/chartex" xmlns:cx7="http://schemas.microsoft.com/office/drawing/2016/5/13/chartex" xmlns:cx8="http://schemas.microsoft.com/office/drawing/2016/5/14/chartex" xmlns:mc="http://schemas.openxmlformats.org/markup-compatibility/2006" xmlns:aink="http://schemas.microsoft.com/office/drawing/2016/ink" xmlns:am3d="http://schemas.microsoft.com/office/drawing/2017/model3d" xmlns:o="urn:schemas-microsoft-com:office:office" xmlns:oel="http://schemas.microsoft.com/office/2019/extlst" xmlns:r="http://schemas.openxmlformats.org/officeDocument/2006/relationships" xmlns:m="http://schemas.openxmlformats.org/officeDocument/2006/math" xmlns:v="urn:schemas-microsoft-com:vml" xmlns:wp14="http://schemas.microsoft.com/office/word/2010/wordprocessingDrawing" xmlns:wp="http://schemas.openxmlformats.org/drawingml/2006/wordprocessingDrawing" xmlns:w10="urn:schemas-microsoft-com:office:word" xmlns:w="http://schemas.openxmlformats.org/wordprocessingml/2006/main" xmlns:w14="http://schemas.microsoft.com/office/word/2010/wordml" xmlns:w15="http://schemas.microsoft.com/office/word/2012/wordml" xmlns:w16cex="http://schemas.microsoft.com/office/word/2018/wordml/cex" xmlns:w16cid="http://schemas.microsoft.com/office/word/2016/wordml/cid" xmlns:w16="http://schemas.microsoft.com/office/word/2018/wordml" xmlns:w16du="http://schemas.microsoft.com/office/word/2023/wordml/word16du" xmlns:w16sdtdh="http://schemas.microsoft.com/office/word/2020/wordml/sdtdatahash" xmlns:w16se="http://schemas.microsoft.com/office/word/2015/wordml/symex" xmlns:wpg="http://schemas.microsoft.com/office/word/2010/wordprocessingGroup" xmlns:wpi="http://schemas.microsoft.com/office/word/2010/wordprocessingInk" xmlns:wne="http://schemas.microsoft.com/office/word/2006/wordml" xmlns:wps="http://schemas.microsoft.com/office/word/2010/wordprocessingShape" mc:Ignorable="w14 w15 w16se w16cid w16 w16cex w16sdtdh w16du wp14">
+<w:endnotes xmlns:wpc="http://schemas.microsoft.com/office/word/2010/wordprocessingCanvas" xmlns:mc="http://schemas.openxmlformats.org/markup-compatibility/2006" xmlns:o="urn:schemas-microsoft-com:office:office" xmlns:r="http://schemas.openxmlformats.org/officeDocument/2006/relationships" xmlns:m="http://schemas.openxmlformats.org/officeDocument/2006/math" xmlns:v="urn:schemas-microsoft-com:vml" xmlns:wp14="http://schemas.microsoft.com/office/word/2010/wordprocessingDrawing" xmlns:wp="http://schemas.openxmlformats.org/drawingml/2006/wordprocessingDrawing" xmlns:w10="urn:schemas-microsoft-com:office:word" xmlns:w="http://schemas.openxmlformats.org/wordprocessingml/2006/main" xmlns:w14="http://schemas.microsoft.com/office/word/2010/wordml" xmlns:wpg="http://schemas.microsoft.com/office/word/2010/wordprocessingGroup" xmlns:wpi="http://schemas.microsoft.com/office/word/2010/wordprocessingInk" xmlns:wne="http://schemas.microsoft.com/office/word/2006/wordml" xmlns:wps="http://schemas.microsoft.com/office/word/2010/wordprocessingShape" mc:Ignorable="w14 wp14">
   <w:endnote w:type="separator" w:id="-1">
     <w:p>
       <w:r>
@@ -10058,7 +9986,7 @@
 </file>
 
 <file path=word/footnotes.xml><?xml version="1.0" encoding="utf-8"?>
-<w:footnotes xmlns:wpc="http://schemas.microsoft.com/office/word/2010/wordprocessingCanvas" xmlns:cx="http://schemas.microsoft.com/office/drawing/2014/chartex" xmlns:cx1="http://schemas.microsoft.com/office/drawing/2015/9/8/chartex" xmlns:cx2="http://schemas.microsoft.com/office/drawing/2015/10/21/chartex" xmlns:cx3="http://schemas.microsoft.com/office/drawing/2016/5/9/chartex" xmlns:cx4="http://schemas.microsoft.com/office/drawing/2016/5/10/chartex" xmlns:cx5="http://schemas.microsoft.com/office/drawing/2016/5/11/chartex" xmlns:cx6="http://schemas.microsoft.com/office/drawing/2016/5/12/chartex" xmlns:cx7="http://schemas.microsoft.com/office/drawing/2016/5/13/chartex" xmlns:cx8="http://schemas.microsoft.com/office/drawing/2016/5/14/chartex" xmlns:mc="http://schemas.openxmlformats.org/markup-compatibility/2006" xmlns:aink="http://schemas.microsoft.com/office/drawing/2016/ink" xmlns:am3d="http://schemas.microsoft.com/office/drawing/2017/model3d" xmlns:o="urn:schemas-microsoft-com:office:office" xmlns:oel="http://schemas.microsoft.com/office/2019/extlst" xmlns:r="http://schemas.openxmlformats.org/officeDocument/2006/relationships" xmlns:m="http://schemas.openxmlformats.org/officeDocument/2006/math" xmlns:v="urn:schemas-microsoft-com:vml" xmlns:wp14="http://schemas.microsoft.com/office/word/2010/wordprocessingDrawing" xmlns:wp="http://schemas.openxmlformats.org/drawingml/2006/wordprocessingDrawing" xmlns:w10="urn:schemas-microsoft-com:office:word" xmlns:w="http://schemas.openxmlformats.org/wordprocessingml/2006/main" xmlns:w14="http://schemas.microsoft.com/office/word/2010/wordml" xmlns:w15="http://schemas.microsoft.com/office/word/2012/wordml" xmlns:w16cex="http://schemas.microsoft.com/office/word/2018/wordml/cex" xmlns:w16cid="http://schemas.microsoft.com/office/word/2016/wordml/cid" xmlns:w16="http://schemas.microsoft.com/office/word/2018/wordml" xmlns:w16du="http://schemas.microsoft.com/office/word/2023/wordml/word16du" xmlns:w16sdtdh="http://schemas.microsoft.com/office/word/2020/wordml/sdtdatahash" xmlns:w16se="http://schemas.microsoft.com/office/word/2015/wordml/symex" xmlns:wpg="http://schemas.microsoft.com/office/word/2010/wordprocessingGroup" xmlns:wpi="http://schemas.microsoft.com/office/word/2010/wordprocessingInk" xmlns:wne="http://schemas.microsoft.com/office/word/2006/wordml" xmlns:wps="http://schemas.microsoft.com/office/word/2010/wordprocessingShape" mc:Ignorable="w14 w15 w16se w16cid w16 w16cex w16sdtdh w16du wp14">
+<w:footnotes xmlns:wpc="http://schemas.microsoft.com/office/word/2010/wordprocessingCanvas" xmlns:mc="http://schemas.openxmlformats.org/markup-compatibility/2006" xmlns:o="urn:schemas-microsoft-com:office:office" xmlns:r="http://schemas.openxmlformats.org/officeDocument/2006/relationships" xmlns:m="http://schemas.openxmlformats.org/officeDocument/2006/math" xmlns:v="urn:schemas-microsoft-com:vml" xmlns:wp14="http://schemas.microsoft.com/office/word/2010/wordprocessingDrawing" xmlns:wp="http://schemas.openxmlformats.org/drawingml/2006/wordprocessingDrawing" xmlns:w10="urn:schemas-microsoft-com:office:word" xmlns:w="http://schemas.openxmlformats.org/wordprocessingml/2006/main" xmlns:w14="http://schemas.microsoft.com/office/word/2010/wordml" xmlns:wpg="http://schemas.microsoft.com/office/word/2010/wordprocessingGroup" xmlns:wpi="http://schemas.microsoft.com/office/word/2010/wordprocessingInk" xmlns:wne="http://schemas.microsoft.com/office/word/2006/wordml" xmlns:wps="http://schemas.microsoft.com/office/word/2010/wordprocessingShape" mc:Ignorable="w14 wp14">
   <w:footnote w:type="separator" w:id="-1">
     <w:p>
       <w:r>
@@ -10077,7 +10005,7 @@
 </file>
 
 <file path=word/header1.xml><?xml version="1.0" encoding="utf-8"?>
-<w:hdr xmlns:wpc="http://schemas.microsoft.com/office/word/2010/wordprocessingCanvas" xmlns:cx="http://schemas.microsoft.com/office/drawing/2014/chartex" xmlns:cx1="http://schemas.microsoft.com/office/drawing/2015/9/8/chartex" xmlns:cx2="http://schemas.microsoft.com/office/drawing/2015/10/21/chartex" xmlns:cx3="http://schemas.microsoft.com/office/drawing/2016/5/9/chartex" xmlns:cx4="http://schemas.microsoft.com/office/drawing/2016/5/10/chartex" xmlns:cx5="http://schemas.microsoft.com/office/drawing/2016/5/11/chartex" xmlns:cx6="http://schemas.microsoft.com/office/drawing/2016/5/12/chartex" xmlns:cx7="http://schemas.microsoft.com/office/drawing/2016/5/13/chartex" xmlns:cx8="http://schemas.microsoft.com/office/drawing/2016/5/14/chartex" xmlns:mc="http://schemas.openxmlformats.org/markup-compatibility/2006" xmlns:aink="http://schemas.microsoft.com/office/drawing/2016/ink" xmlns:am3d="http://schemas.microsoft.com/office/drawing/2017/model3d" xmlns:o="urn:schemas-microsoft-com:office:office" xmlns:oel="http://schemas.microsoft.com/office/2019/extlst" xmlns:r="http://schemas.openxmlformats.org/officeDocument/2006/relationships" xmlns:m="http://schemas.openxmlformats.org/officeDocument/2006/math" xmlns:v="urn:schemas-microsoft-com:vml" xmlns:wp14="http://schemas.microsoft.com/office/word/2010/wordprocessingDrawing" xmlns:wp="http://schemas.openxmlformats.org/drawingml/2006/wordprocessingDrawing" xmlns:w10="urn:schemas-microsoft-com:office:word" xmlns:w="http://schemas.openxmlformats.org/wordprocessingml/2006/main" xmlns:w14="http://schemas.microsoft.com/office/word/2010/wordml" xmlns:w15="http://schemas.microsoft.com/office/word/2012/wordml" xmlns:w16cex="http://schemas.microsoft.com/office/word/2018/wordml/cex" xmlns:w16cid="http://schemas.microsoft.com/office/word/2016/wordml/cid" xmlns:w16="http://schemas.microsoft.com/office/word/2018/wordml" xmlns:w16du="http://schemas.microsoft.com/office/word/2023/wordml/word16du" xmlns:w16sdtdh="http://schemas.microsoft.com/office/word/2020/wordml/sdtdatahash" xmlns:w16se="http://schemas.microsoft.com/office/word/2015/wordml/symex" xmlns:wpg="http://schemas.microsoft.com/office/word/2010/wordprocessingGroup" xmlns:wpi="http://schemas.microsoft.com/office/word/2010/wordprocessingInk" xmlns:wne="http://schemas.microsoft.com/office/word/2006/wordml" xmlns:wps="http://schemas.microsoft.com/office/word/2010/wordprocessingShape" mc:Ignorable="w14 w15 w16se w16cid w16 w16cex w16sdtdh w16du wp14">
+<w:hdr xmlns:wpc="http://schemas.microsoft.com/office/word/2010/wordprocessingCanvas" xmlns:mc="http://schemas.openxmlformats.org/markup-compatibility/2006" xmlns:o="urn:schemas-microsoft-com:office:office" xmlns:r="http://schemas.openxmlformats.org/officeDocument/2006/relationships" xmlns:m="http://schemas.openxmlformats.org/officeDocument/2006/math" xmlns:v="urn:schemas-microsoft-com:vml" xmlns:wp14="http://schemas.microsoft.com/office/word/2010/wordprocessingDrawing" xmlns:wp="http://schemas.openxmlformats.org/drawingml/2006/wordprocessingDrawing" xmlns:w10="urn:schemas-microsoft-com:office:word" xmlns:w="http://schemas.openxmlformats.org/wordprocessingml/2006/main" xmlns:w14="http://schemas.microsoft.com/office/word/2010/wordml" xmlns:wpg="http://schemas.microsoft.com/office/word/2010/wordprocessingGroup" xmlns:wpi="http://schemas.microsoft.com/office/word/2010/wordprocessingInk" xmlns:wne="http://schemas.microsoft.com/office/word/2006/wordml" xmlns:wps="http://schemas.microsoft.com/office/word/2010/wordprocessingShape" mc:Ignorable="w14 wp14">
   <w:p>
     <w:pPr>
       <w:pStyle w:val="Header"/>
@@ -10093,8 +10021,8 @@
 </file>
 
 <file path=word/numbering.xml><?xml version="1.0" encoding="utf-8"?>
-<w:numbering xmlns:wpc="http://schemas.microsoft.com/office/word/2010/wordprocessingCanvas" xmlns:cx="http://schemas.microsoft.com/office/drawing/2014/chartex" xmlns:cx1="http://schemas.microsoft.com/office/drawing/2015/9/8/chartex" xmlns:cx2="http://schemas.microsoft.com/office/drawing/2015/10/21/chartex" xmlns:cx3="http://schemas.microsoft.com/office/drawing/2016/5/9/chartex" xmlns:cx4="http://schemas.microsoft.com/office/drawing/2016/5/10/chartex" xmlns:cx5="http://schemas.microsoft.com/office/drawing/2016/5/11/chartex" xmlns:cx6="http://schemas.microsoft.com/office/drawing/2016/5/12/chartex" xmlns:cx7="http://schemas.microsoft.com/office/drawing/2016/5/13/chartex" xmlns:cx8="http://schemas.microsoft.com/office/drawing/2016/5/14/chartex" xmlns:mc="http://schemas.openxmlformats.org/markup-compatibility/2006" xmlns:aink="http://schemas.microsoft.com/office/drawing/2016/ink" xmlns:am3d="http://schemas.microsoft.com/office/drawing/2017/model3d" xmlns:o="urn:schemas-microsoft-com:office:office" xmlns:oel="http://schemas.microsoft.com/office/2019/extlst" xmlns:r="http://schemas.openxmlformats.org/officeDocument/2006/relationships" xmlns:m="http://schemas.openxmlformats.org/officeDocument/2006/math" xmlns:v="urn:schemas-microsoft-com:vml" xmlns:wp14="http://schemas.microsoft.com/office/word/2010/wordprocessingDrawing" xmlns:wp="http://schemas.openxmlformats.org/drawingml/2006/wordprocessingDrawing" xmlns:w10="urn:schemas-microsoft-com:office:word" xmlns:w="http://schemas.openxmlformats.org/wordprocessingml/2006/main" xmlns:w14="http://schemas.microsoft.com/office/word/2010/wordml" xmlns:w15="http://schemas.microsoft.com/office/word/2012/wordml" xmlns:w16cex="http://schemas.microsoft.com/office/word/2018/wordml/cex" xmlns:w16cid="http://schemas.microsoft.com/office/word/2016/wordml/cid" xmlns:w16="http://schemas.microsoft.com/office/word/2018/wordml" xmlns:w16du="http://schemas.microsoft.com/office/word/2023/wordml/word16du" xmlns:w16sdtdh="http://schemas.microsoft.com/office/word/2020/wordml/sdtdatahash" xmlns:w16se="http://schemas.microsoft.com/office/word/2015/wordml/symex" xmlns:wpg="http://schemas.microsoft.com/office/word/2010/wordprocessingGroup" xmlns:wpi="http://schemas.microsoft.com/office/word/2010/wordprocessingInk" xmlns:wne="http://schemas.microsoft.com/office/word/2006/wordml" xmlns:wps="http://schemas.microsoft.com/office/word/2010/wordprocessingShape" mc:Ignorable="w14 w15 w16se w16cid w16 w16cex w16sdtdh w16du wp14">
-  <w:abstractNum w:abstractNumId="0" w15:restartNumberingAfterBreak="0">
+<w:numbering xmlns:wpc="http://schemas.microsoft.com/office/word/2010/wordprocessingCanvas" xmlns:mc="http://schemas.openxmlformats.org/markup-compatibility/2006" xmlns:o="urn:schemas-microsoft-com:office:office" xmlns:r="http://schemas.openxmlformats.org/officeDocument/2006/relationships" xmlns:m="http://schemas.openxmlformats.org/officeDocument/2006/math" xmlns:v="urn:schemas-microsoft-com:vml" xmlns:wp14="http://schemas.microsoft.com/office/word/2010/wordprocessingDrawing" xmlns:wp="http://schemas.openxmlformats.org/drawingml/2006/wordprocessingDrawing" xmlns:w10="urn:schemas-microsoft-com:office:word" xmlns:w="http://schemas.openxmlformats.org/wordprocessingml/2006/main" xmlns:w14="http://schemas.microsoft.com/office/word/2010/wordml" xmlns:wpg="http://schemas.microsoft.com/office/word/2010/wordprocessingGroup" xmlns:wpi="http://schemas.microsoft.com/office/word/2010/wordprocessingInk" xmlns:wne="http://schemas.microsoft.com/office/word/2006/wordml" xmlns:wps="http://schemas.microsoft.com/office/word/2010/wordprocessingShape" mc:Ignorable="w14 wp14">
+  <w:abstractNum w:abstractNumId="0">
     <w:nsid w:val="0F9440A3"/>
     <w:multiLevelType w:val="hybridMultilevel"/>
     <w:tmpl w:val="4E42AC02"/>
@@ -10185,7 +10113,7 @@
       </w:pPr>
     </w:lvl>
   </w:abstractNum>
-  <w:abstractNum w:abstractNumId="1" w15:restartNumberingAfterBreak="0">
+  <w:abstractNum w:abstractNumId="1">
     <w:nsid w:val="32AB156B"/>
     <w:multiLevelType w:val="hybridMultilevel"/>
     <w:tmpl w:val="EE2A6750"/>
@@ -10274,7 +10202,7 @@
       </w:pPr>
     </w:lvl>
   </w:abstractNum>
-  <w:abstractNum w:abstractNumId="2" w15:restartNumberingAfterBreak="0">
+  <w:abstractNum w:abstractNumId="2">
     <w:nsid w:val="45411E3A"/>
     <w:multiLevelType w:val="hybridMultilevel"/>
     <w:tmpl w:val="446A1A80"/>
@@ -10363,20 +10291,20 @@
       </w:pPr>
     </w:lvl>
   </w:abstractNum>
-  <w:num w:numId="1" w16cid:durableId="1019701353">
+  <w:num w:numId="1">
     <w:abstractNumId w:val="2"/>
   </w:num>
-  <w:num w:numId="2" w16cid:durableId="68891151">
+  <w:num w:numId="2">
     <w:abstractNumId w:val="1"/>
   </w:num>
-  <w:num w:numId="3" w16cid:durableId="334650368">
+  <w:num w:numId="3">
     <w:abstractNumId w:val="0"/>
   </w:num>
 </w:numbering>
 </file>
 
 <file path=word/styles.xml><?xml version="1.0" encoding="utf-8"?>
-<w:styles xmlns:mc="http://schemas.openxmlformats.org/markup-compatibility/2006" xmlns:r="http://schemas.openxmlformats.org/officeDocument/2006/relationships" xmlns:w="http://schemas.openxmlformats.org/wordprocessingml/2006/main" xmlns:w14="http://schemas.microsoft.com/office/word/2010/wordml" xmlns:w15="http://schemas.microsoft.com/office/word/2012/wordml" xmlns:w16cex="http://schemas.microsoft.com/office/word/2018/wordml/cex" xmlns:w16cid="http://schemas.microsoft.com/office/word/2016/wordml/cid" xmlns:w16="http://schemas.microsoft.com/office/word/2018/wordml" xmlns:w16du="http://schemas.microsoft.com/office/word/2023/wordml/word16du" xmlns:w16sdtdh="http://schemas.microsoft.com/office/word/2020/wordml/sdtdatahash" xmlns:w16se="http://schemas.microsoft.com/office/word/2015/wordml/symex" mc:Ignorable="w14 w15 w16se w16cid w16 w16cex w16sdtdh w16du">
+<w:styles xmlns:mc="http://schemas.openxmlformats.org/markup-compatibility/2006" xmlns:r="http://schemas.openxmlformats.org/officeDocument/2006/relationships" xmlns:w="http://schemas.openxmlformats.org/wordprocessingml/2006/main" xmlns:w14="http://schemas.microsoft.com/office/word/2010/wordml" mc:Ignorable="w14">
   <w:docDefaults>
     <w:rPrDefault>
       <w:rPr>
@@ -10390,383 +10318,146 @@
     </w:rPrDefault>
     <w:pPrDefault/>
   </w:docDefaults>
-  <w:latentStyles w:defLockedState="0" w:defUIPriority="99" w:defSemiHidden="0" w:defUnhideWhenUsed="0" w:defQFormat="0" w:count="376">
-    <w:lsdException w:name="Normal" w:uiPriority="0" w:qFormat="1"/>
-    <w:lsdException w:name="heading 1" w:uiPriority="9" w:qFormat="1"/>
-    <w:lsdException w:name="heading 2" w:semiHidden="1" w:uiPriority="9" w:unhideWhenUsed="1" w:qFormat="1"/>
-    <w:lsdException w:name="heading 3" w:semiHidden="1" w:uiPriority="9" w:unhideWhenUsed="1" w:qFormat="1"/>
-    <w:lsdException w:name="heading 4" w:semiHidden="1" w:uiPriority="9" w:unhideWhenUsed="1" w:qFormat="1"/>
-    <w:lsdException w:name="heading 5" w:semiHidden="1" w:uiPriority="9" w:unhideWhenUsed="1" w:qFormat="1"/>
-    <w:lsdException w:name="heading 6" w:semiHidden="1" w:uiPriority="9" w:unhideWhenUsed="1" w:qFormat="1"/>
-    <w:lsdException w:name="heading 7" w:semiHidden="1" w:uiPriority="9" w:unhideWhenUsed="1" w:qFormat="1"/>
-    <w:lsdException w:name="heading 8" w:semiHidden="1" w:uiPriority="9" w:unhideWhenUsed="1" w:qFormat="1"/>
-    <w:lsdException w:name="heading 9" w:semiHidden="1" w:uiPriority="9" w:unhideWhenUsed="1" w:qFormat="1"/>
-    <w:lsdException w:name="index 1" w:semiHidden="1" w:unhideWhenUsed="1"/>
-    <w:lsdException w:name="index 2" w:semiHidden="1" w:unhideWhenUsed="1"/>
-    <w:lsdException w:name="index 3" w:semiHidden="1" w:unhideWhenUsed="1"/>
-    <w:lsdException w:name="index 4" w:semiHidden="1" w:unhideWhenUsed="1"/>
-    <w:lsdException w:name="index 5" w:semiHidden="1" w:unhideWhenUsed="1"/>
-    <w:lsdException w:name="index 6" w:semiHidden="1" w:unhideWhenUsed="1"/>
-    <w:lsdException w:name="index 7" w:semiHidden="1" w:unhideWhenUsed="1"/>
-    <w:lsdException w:name="index 8" w:semiHidden="1" w:unhideWhenUsed="1"/>
-    <w:lsdException w:name="index 9" w:semiHidden="1" w:unhideWhenUsed="1"/>
-    <w:lsdException w:name="toc 1" w:semiHidden="1" w:uiPriority="39" w:unhideWhenUsed="1"/>
-    <w:lsdException w:name="toc 2" w:semiHidden="1" w:uiPriority="39" w:unhideWhenUsed="1"/>
-    <w:lsdException w:name="toc 3" w:semiHidden="1" w:uiPriority="39" w:unhideWhenUsed="1"/>
-    <w:lsdException w:name="toc 4" w:semiHidden="1" w:uiPriority="39" w:unhideWhenUsed="1"/>
-    <w:lsdException w:name="toc 5" w:semiHidden="1" w:uiPriority="39" w:unhideWhenUsed="1"/>
-    <w:lsdException w:name="toc 6" w:semiHidden="1" w:uiPriority="39" w:unhideWhenUsed="1"/>
-    <w:lsdException w:name="toc 7" w:semiHidden="1" w:uiPriority="39" w:unhideWhenUsed="1"/>
-    <w:lsdException w:name="toc 8" w:semiHidden="1" w:uiPriority="39" w:unhideWhenUsed="1"/>
-    <w:lsdException w:name="toc 9" w:semiHidden="1" w:uiPriority="39" w:unhideWhenUsed="1"/>
-    <w:lsdException w:name="Normal Indent" w:semiHidden="1" w:unhideWhenUsed="1"/>
-    <w:lsdException w:name="footnote text" w:semiHidden="1" w:unhideWhenUsed="1"/>
-    <w:lsdException w:name="annotation text" w:semiHidden="1" w:unhideWhenUsed="1"/>
-    <w:lsdException w:name="header" w:semiHidden="1" w:unhideWhenUsed="1"/>
-    <w:lsdException w:name="footer" w:semiHidden="1" w:unhideWhenUsed="1"/>
-    <w:lsdException w:name="index heading" w:semiHidden="1" w:unhideWhenUsed="1"/>
-    <w:lsdException w:name="caption" w:semiHidden="1" w:uiPriority="35" w:unhideWhenUsed="1" w:qFormat="1"/>
-    <w:lsdException w:name="table of figures" w:semiHidden="1" w:unhideWhenUsed="1"/>
-    <w:lsdException w:name="envelope address" w:semiHidden="1" w:unhideWhenUsed="1"/>
-    <w:lsdException w:name="envelope return" w:semiHidden="1" w:unhideWhenUsed="1"/>
-    <w:lsdException w:name="footnote reference" w:semiHidden="1" w:unhideWhenUsed="1"/>
-    <w:lsdException w:name="annotation reference" w:semiHidden="1" w:unhideWhenUsed="1"/>
-    <w:lsdException w:name="line number" w:semiHidden="1" w:unhideWhenUsed="1"/>
-    <w:lsdException w:name="page number" w:semiHidden="1" w:unhideWhenUsed="1"/>
-    <w:lsdException w:name="endnote reference" w:semiHidden="1" w:unhideWhenUsed="1"/>
-    <w:lsdException w:name="endnote text" w:semiHidden="1" w:unhideWhenUsed="1"/>
-    <w:lsdException w:name="table of authorities" w:semiHidden="1" w:unhideWhenUsed="1"/>
-    <w:lsdException w:name="macro" w:semiHidden="1" w:unhideWhenUsed="1"/>
-    <w:lsdException w:name="toa heading" w:semiHidden="1" w:unhideWhenUsed="1"/>
-    <w:lsdException w:name="List" w:semiHidden="1" w:unhideWhenUsed="1"/>
-    <w:lsdException w:name="List Bullet" w:semiHidden="1" w:unhideWhenUsed="1"/>
-    <w:lsdException w:name="List Number" w:semiHidden="1" w:unhideWhenUsed="1"/>
-    <w:lsdException w:name="List 2" w:semiHidden="1" w:unhideWhenUsed="1"/>
-    <w:lsdException w:name="List 3" w:semiHidden="1" w:unhideWhenUsed="1"/>
-    <w:lsdException w:name="List 4" w:semiHidden="1" w:unhideWhenUsed="1"/>
-    <w:lsdException w:name="List 5" w:semiHidden="1" w:unhideWhenUsed="1"/>
-    <w:lsdException w:name="List Bullet 2" w:semiHidden="1" w:unhideWhenUsed="1"/>
-    <w:lsdException w:name="List Bullet 3" w:semiHidden="1" w:unhideWhenUsed="1"/>
-    <w:lsdException w:name="List Bullet 4" w:semiHidden="1" w:unhideWhenUsed="1"/>
-    <w:lsdException w:name="List Bullet 5" w:semiHidden="1" w:unhideWhenUsed="1"/>
-    <w:lsdException w:name="List Number 2" w:semiHidden="1" w:unhideWhenUsed="1"/>
-    <w:lsdException w:name="List Number 3" w:semiHidden="1" w:unhideWhenUsed="1"/>
-    <w:lsdException w:name="List Number 4" w:semiHidden="1" w:unhideWhenUsed="1"/>
-    <w:lsdException w:name="List Number 5" w:semiHidden="1" w:unhideWhenUsed="1"/>
-    <w:lsdException w:name="Title" w:uiPriority="0" w:qFormat="1"/>
-    <w:lsdException w:name="Closing" w:semiHidden="1" w:unhideWhenUsed="1"/>
-    <w:lsdException w:name="Signature" w:semiHidden="1" w:unhideWhenUsed="1"/>
-    <w:lsdException w:name="Default Paragraph Font" w:semiHidden="1" w:uiPriority="1" w:unhideWhenUsed="1"/>
-    <w:lsdException w:name="Body Text" w:semiHidden="1" w:uiPriority="0" w:unhideWhenUsed="1"/>
-    <w:lsdException w:name="Body Text Indent" w:semiHidden="1" w:unhideWhenUsed="1"/>
-    <w:lsdException w:name="List Continue" w:semiHidden="1" w:unhideWhenUsed="1"/>
-    <w:lsdException w:name="List Continue 2" w:semiHidden="1" w:unhideWhenUsed="1"/>
-    <w:lsdException w:name="List Continue 3" w:semiHidden="1" w:unhideWhenUsed="1"/>
-    <w:lsdException w:name="List Continue 4" w:semiHidden="1" w:unhideWhenUsed="1"/>
-    <w:lsdException w:name="List Continue 5" w:semiHidden="1" w:unhideWhenUsed="1"/>
-    <w:lsdException w:name="Message Header" w:semiHidden="1" w:unhideWhenUsed="1"/>
-    <w:lsdException w:name="Subtitle" w:uiPriority="11" w:qFormat="1"/>
-    <w:lsdException w:name="Salutation" w:semiHidden="1" w:unhideWhenUsed="1"/>
-    <w:lsdException w:name="Date" w:semiHidden="1" w:unhideWhenUsed="1"/>
-    <w:lsdException w:name="Body Text First Indent" w:semiHidden="1" w:unhideWhenUsed="1"/>
-    <w:lsdException w:name="Body Text First Indent 2" w:semiHidden="1" w:unhideWhenUsed="1"/>
-    <w:lsdException w:name="Note Heading" w:semiHidden="1" w:unhideWhenUsed="1"/>
-    <w:lsdException w:name="Body Text 2" w:semiHidden="1" w:unhideWhenUsed="1"/>
-    <w:lsdException w:name="Body Text 3" w:semiHidden="1" w:uiPriority="0" w:unhideWhenUsed="1"/>
-    <w:lsdException w:name="Body Text Indent 2" w:semiHidden="1" w:unhideWhenUsed="1"/>
-    <w:lsdException w:name="Body Text Indent 3" w:semiHidden="1" w:unhideWhenUsed="1"/>
-    <w:lsdException w:name="Block Text" w:semiHidden="1" w:unhideWhenUsed="1"/>
-    <w:lsdException w:name="Hyperlink" w:semiHidden="1" w:unhideWhenUsed="1"/>
-    <w:lsdException w:name="FollowedHyperlink" w:semiHidden="1" w:unhideWhenUsed="1"/>
-    <w:lsdException w:name="Strong" w:uiPriority="22" w:qFormat="1"/>
-    <w:lsdException w:name="Emphasis" w:uiPriority="20" w:qFormat="1"/>
-    <w:lsdException w:name="Document Map" w:semiHidden="1" w:unhideWhenUsed="1"/>
-    <w:lsdException w:name="Plain Text" w:semiHidden="1" w:unhideWhenUsed="1"/>
-    <w:lsdException w:name="E-mail Signature" w:semiHidden="1" w:unhideWhenUsed="1"/>
-    <w:lsdException w:name="HTML Top of Form" w:semiHidden="1" w:unhideWhenUsed="1"/>
-    <w:lsdException w:name="HTML Bottom of Form" w:semiHidden="1" w:unhideWhenUsed="1"/>
-    <w:lsdException w:name="Normal (Web)" w:semiHidden="1" w:unhideWhenUsed="1"/>
-    <w:lsdException w:name="HTML Acronym" w:semiHidden="1" w:unhideWhenUsed="1"/>
-    <w:lsdException w:name="HTML Address" w:semiHidden="1" w:unhideWhenUsed="1"/>
-    <w:lsdException w:name="HTML Cite" w:semiHidden="1" w:unhideWhenUsed="1"/>
-    <w:lsdException w:name="HTML Code" w:semiHidden="1" w:unhideWhenUsed="1"/>
-    <w:lsdException w:name="HTML Definition" w:semiHidden="1" w:unhideWhenUsed="1"/>
-    <w:lsdException w:name="HTML Keyboard" w:semiHidden="1" w:unhideWhenUsed="1"/>
-    <w:lsdException w:name="HTML Preformatted" w:semiHidden="1" w:unhideWhenUsed="1"/>
-    <w:lsdException w:name="HTML Sample" w:semiHidden="1" w:unhideWhenUsed="1"/>
-    <w:lsdException w:name="HTML Typewriter" w:semiHidden="1" w:unhideWhenUsed="1"/>
-    <w:lsdException w:name="HTML Variable" w:semiHidden="1" w:unhideWhenUsed="1"/>
-    <w:lsdException w:name="Normal Table" w:semiHidden="1" w:unhideWhenUsed="1"/>
-    <w:lsdException w:name="annotation subject" w:semiHidden="1" w:unhideWhenUsed="1"/>
-    <w:lsdException w:name="No List" w:semiHidden="1" w:unhideWhenUsed="1"/>
-    <w:lsdException w:name="Outline List 1" w:semiHidden="1" w:unhideWhenUsed="1"/>
-    <w:lsdException w:name="Outline List 2" w:semiHidden="1" w:unhideWhenUsed="1"/>
-    <w:lsdException w:name="Outline List 3" w:semiHidden="1" w:unhideWhenUsed="1"/>
-    <w:lsdException w:name="Table Simple 1" w:semiHidden="1" w:unhideWhenUsed="1"/>
-    <w:lsdException w:name="Table Simple 2" w:semiHidden="1" w:unhideWhenUsed="1"/>
-    <w:lsdException w:name="Table Simple 3" w:semiHidden="1" w:unhideWhenUsed="1"/>
-    <w:lsdException w:name="Table Classic 1" w:semiHidden="1" w:unhideWhenUsed="1"/>
-    <w:lsdException w:name="Table Classic 2" w:semiHidden="1" w:unhideWhenUsed="1"/>
-    <w:lsdException w:name="Table Classic 3" w:semiHidden="1" w:unhideWhenUsed="1"/>
-    <w:lsdException w:name="Table Classic 4" w:semiHidden="1" w:unhideWhenUsed="1"/>
-    <w:lsdException w:name="Table Colorful 1" w:semiHidden="1" w:unhideWhenUsed="1"/>
-    <w:lsdException w:name="Table Colorful 2" w:semiHidden="1" w:unhideWhenUsed="1"/>
-    <w:lsdException w:name="Table Colorful 3" w:semiHidden="1" w:unhideWhenUsed="1"/>
-    <w:lsdException w:name="Table Columns 1" w:semiHidden="1" w:unhideWhenUsed="1"/>
-    <w:lsdException w:name="Table Columns 2" w:semiHidden="1" w:unhideWhenUsed="1"/>
-    <w:lsdException w:name="Table Columns 3" w:semiHidden="1" w:unhideWhenUsed="1"/>
-    <w:lsdException w:name="Table Columns 4" w:semiHidden="1" w:unhideWhenUsed="1"/>
-    <w:lsdException w:name="Table Columns 5" w:semiHidden="1" w:unhideWhenUsed="1"/>
-    <w:lsdException w:name="Table Grid 1" w:semiHidden="1" w:unhideWhenUsed="1"/>
-    <w:lsdException w:name="Table Grid 2" w:semiHidden="1" w:unhideWhenUsed="1"/>
-    <w:lsdException w:name="Table Grid 3" w:semiHidden="1" w:unhideWhenUsed="1"/>
-    <w:lsdException w:name="Table Grid 4" w:semiHidden="1" w:unhideWhenUsed="1"/>
-    <w:lsdException w:name="Table Grid 5" w:semiHidden="1" w:unhideWhenUsed="1"/>
-    <w:lsdException w:name="Table Grid 6" w:semiHidden="1" w:unhideWhenUsed="1"/>
-    <w:lsdException w:name="Table Grid 7" w:semiHidden="1" w:unhideWhenUsed="1"/>
-    <w:lsdException w:name="Table Grid 8" w:semiHidden="1" w:unhideWhenUsed="1"/>
-    <w:lsdException w:name="Table List 1" w:semiHidden="1" w:unhideWhenUsed="1"/>
-    <w:lsdException w:name="Table List 2" w:semiHidden="1" w:unhideWhenUsed="1"/>
-    <w:lsdException w:name="Table List 3" w:semiHidden="1" w:unhideWhenUsed="1"/>
-    <w:lsdException w:name="Table List 4" w:semiHidden="1" w:unhideWhenUsed="1"/>
-    <w:lsdException w:name="Table List 5" w:semiHidden="1" w:unhideWhenUsed="1"/>
-    <w:lsdException w:name="Table List 6" w:semiHidden="1" w:unhideWhenUsed="1"/>
-    <w:lsdException w:name="Table List 7" w:semiHidden="1" w:unhideWhenUsed="1"/>
-    <w:lsdException w:name="Table List 8" w:semiHidden="1" w:unhideWhenUsed="1"/>
-    <w:lsdException w:name="Table 3D effects 1" w:semiHidden="1" w:unhideWhenUsed="1"/>
-    <w:lsdException w:name="Table 3D effects 2" w:semiHidden="1" w:unhideWhenUsed="1"/>
-    <w:lsdException w:name="Table 3D effects 3" w:semiHidden="1" w:unhideWhenUsed="1"/>
-    <w:lsdException w:name="Table Contemporary" w:semiHidden="1" w:unhideWhenUsed="1"/>
-    <w:lsdException w:name="Table Elegant" w:semiHidden="1" w:unhideWhenUsed="1"/>
-    <w:lsdException w:name="Table Professional" w:semiHidden="1" w:unhideWhenUsed="1"/>
-    <w:lsdException w:name="Table Subtle 1" w:semiHidden="1" w:unhideWhenUsed="1"/>
-    <w:lsdException w:name="Table Subtle 2" w:semiHidden="1" w:unhideWhenUsed="1"/>
-    <w:lsdException w:name="Table Web 1" w:semiHidden="1" w:unhideWhenUsed="1"/>
-    <w:lsdException w:name="Table Web 2" w:semiHidden="1" w:unhideWhenUsed="1"/>
-    <w:lsdException w:name="Table Web 3" w:semiHidden="1" w:unhideWhenUsed="1"/>
-    <w:lsdException w:name="Balloon Text" w:semiHidden="1" w:unhideWhenUsed="1"/>
-    <w:lsdException w:name="Table Grid" w:uiPriority="59"/>
-    <w:lsdException w:name="Table Theme" w:semiHidden="1" w:unhideWhenUsed="1"/>
-    <w:lsdException w:name="Placeholder Text" w:semiHidden="1"/>
-    <w:lsdException w:name="No Spacing" w:uiPriority="1" w:qFormat="1"/>
-    <w:lsdException w:name="Light Shading" w:uiPriority="60"/>
-    <w:lsdException w:name="Light List" w:uiPriority="61"/>
-    <w:lsdException w:name="Light Grid" w:uiPriority="62"/>
-    <w:lsdException w:name="Medium Shading 1" w:uiPriority="63"/>
-    <w:lsdException w:name="Medium Shading 2" w:uiPriority="64"/>
-    <w:lsdException w:name="Medium List 1" w:uiPriority="65"/>
-    <w:lsdException w:name="Medium List 2" w:uiPriority="66"/>
-    <w:lsdException w:name="Medium Grid 1" w:uiPriority="67"/>
-    <w:lsdException w:name="Medium Grid 2" w:uiPriority="68"/>
-    <w:lsdException w:name="Medium Grid 3" w:uiPriority="69"/>
-    <w:lsdException w:name="Dark List" w:uiPriority="70"/>
-    <w:lsdException w:name="Colorful Shading" w:uiPriority="71"/>
-    <w:lsdException w:name="Colorful List" w:uiPriority="72"/>
-    <w:lsdException w:name="Colorful Grid" w:uiPriority="73"/>
-    <w:lsdException w:name="Light Shading Accent 1" w:uiPriority="60"/>
-    <w:lsdException w:name="Light List Accent 1" w:uiPriority="61"/>
-    <w:lsdException w:name="Light Grid Accent 1" w:uiPriority="62"/>
-    <w:lsdException w:name="Medium Shading 1 Accent 1" w:uiPriority="63"/>
-    <w:lsdException w:name="Medium Shading 2 Accent 1" w:uiPriority="64"/>
-    <w:lsdException w:name="Medium List 1 Accent 1" w:uiPriority="65"/>
-    <w:lsdException w:name="Revision" w:semiHidden="1"/>
-    <w:lsdException w:name="List Paragraph" w:uiPriority="34" w:qFormat="1"/>
-    <w:lsdException w:name="Quote" w:uiPriority="29" w:qFormat="1"/>
-    <w:lsdException w:name="Intense Quote" w:uiPriority="30" w:qFormat="1"/>
-    <w:lsdException w:name="Medium List 2 Accent 1" w:uiPriority="66"/>
-    <w:lsdException w:name="Medium Grid 1 Accent 1" w:uiPriority="67"/>
-    <w:lsdException w:name="Medium Grid 2 Accent 1" w:uiPriority="68"/>
-    <w:lsdException w:name="Medium Grid 3 Accent 1" w:uiPriority="69"/>
-    <w:lsdException w:name="Dark List Accent 1" w:uiPriority="70"/>
-    <w:lsdException w:name="Colorful Shading Accent 1" w:uiPriority="71"/>
-    <w:lsdException w:name="Colorful List Accent 1" w:uiPriority="72"/>
-    <w:lsdException w:name="Colorful Grid Accent 1" w:uiPriority="73"/>
-    <w:lsdException w:name="Light Shading Accent 2" w:uiPriority="60"/>
-    <w:lsdException w:name="Light List Accent 2" w:uiPriority="61"/>
-    <w:lsdException w:name="Light Grid Accent 2" w:uiPriority="62"/>
-    <w:lsdException w:name="Medium Shading 1 Accent 2" w:uiPriority="63"/>
-    <w:lsdException w:name="Medium Shading 2 Accent 2" w:uiPriority="64"/>
-    <w:lsdException w:name="Medium List 1 Accent 2" w:uiPriority="65"/>
-    <w:lsdException w:name="Medium List 2 Accent 2" w:uiPriority="66"/>
-    <w:lsdException w:name="Medium Grid 1 Accent 2" w:uiPriority="67"/>
-    <w:lsdException w:name="Medium Grid 2 Accent 2" w:uiPriority="68"/>
-    <w:lsdException w:name="Medium Grid 3 Accent 2" w:uiPriority="69"/>
-    <w:lsdException w:name="Dark List Accent 2" w:uiPriority="70"/>
-    <w:lsdException w:name="Colorful Shading Accent 2" w:uiPriority="71"/>
-    <w:lsdException w:name="Colorful List Accent 2" w:uiPriority="72"/>
-    <w:lsdException w:name="Colorful Grid Accent 2" w:uiPriority="73"/>
-    <w:lsdException w:name="Light Shading Accent 3" w:uiPriority="60"/>
-    <w:lsdException w:name="Light List Accent 3" w:uiPriority="61"/>
-    <w:lsdException w:name="Light Grid Accent 3" w:uiPriority="62"/>
-    <w:lsdException w:name="Medium Shading 1 Accent 3" w:uiPriority="63"/>
-    <w:lsdException w:name="Medium Shading 2 Accent 3" w:uiPriority="64"/>
-    <w:lsdException w:name="Medium List 1 Accent 3" w:uiPriority="65"/>
-    <w:lsdException w:name="Medium List 2 Accent 3" w:uiPriority="66"/>
-    <w:lsdException w:name="Medium Grid 1 Accent 3" w:uiPriority="67"/>
-    <w:lsdException w:name="Medium Grid 2 Accent 3" w:uiPriority="68"/>
-    <w:lsdException w:name="Medium Grid 3 Accent 3" w:uiPriority="69"/>
-    <w:lsdException w:name="Dark List Accent 3" w:uiPriority="70"/>
-    <w:lsdException w:name="Colorful Shading Accent 3" w:uiPriority="71"/>
-    <w:lsdException w:name="Colorful List Accent 3" w:uiPriority="72"/>
-    <w:lsdException w:name="Colorful Grid Accent 3" w:uiPriority="73"/>
-    <w:lsdException w:name="Light Shading Accent 4" w:uiPriority="60"/>
-    <w:lsdException w:name="Light List Accent 4" w:uiPriority="61"/>
-    <w:lsdException w:name="Light Grid Accent 4" w:uiPriority="62"/>
-    <w:lsdException w:name="Medium Shading 1 Accent 4" w:uiPriority="63"/>
-    <w:lsdException w:name="Medium Shading 2 Accent 4" w:uiPriority="64"/>
-    <w:lsdException w:name="Medium List 1 Accent 4" w:uiPriority="65"/>
-    <w:lsdException w:name="Medium List 2 Accent 4" w:uiPriority="66"/>
-    <w:lsdException w:name="Medium Grid 1 Accent 4" w:uiPriority="67"/>
-    <w:lsdException w:name="Medium Grid 2 Accent 4" w:uiPriority="68"/>
-    <w:lsdException w:name="Medium Grid 3 Accent 4" w:uiPriority="69"/>
-    <w:lsdException w:name="Dark List Accent 4" w:uiPriority="70"/>
-    <w:lsdException w:name="Colorful Shading Accent 4" w:uiPriority="71"/>
-    <w:lsdException w:name="Colorful List Accent 4" w:uiPriority="72"/>
-    <w:lsdException w:name="Colorful Grid Accent 4" w:uiPriority="73"/>
-    <w:lsdException w:name="Light Shading Accent 5" w:uiPriority="60"/>
-    <w:lsdException w:name="Light List Accent 5" w:uiPriority="61"/>
-    <w:lsdException w:name="Light Grid Accent 5" w:uiPriority="62"/>
-    <w:lsdException w:name="Medium Shading 1 Accent 5" w:uiPriority="63"/>
-    <w:lsdException w:name="Medium Shading 2 Accent 5" w:uiPriority="64"/>
-    <w:lsdException w:name="Medium List 1 Accent 5" w:uiPriority="65"/>
-    <w:lsdException w:name="Medium List 2 Accent 5" w:uiPriority="66"/>
-    <w:lsdException w:name="Medium Grid 1 Accent 5" w:uiPriority="67"/>
-    <w:lsdException w:name="Medium Grid 2 Accent 5" w:uiPriority="68"/>
-    <w:lsdException w:name="Medium Grid 3 Accent 5" w:uiPriority="69"/>
-    <w:lsdException w:name="Dark List Accent 5" w:uiPriority="70"/>
-    <w:lsdException w:name="Colorful Shading Accent 5" w:uiPriority="71"/>
-    <w:lsdException w:name="Colorful List Accent 5" w:uiPriority="72"/>
-    <w:lsdException w:name="Colorful Grid Accent 5" w:uiPriority="73"/>
-    <w:lsdException w:name="Light Shading Accent 6" w:uiPriority="60"/>
-    <w:lsdException w:name="Light List Accent 6" w:uiPriority="61"/>
-    <w:lsdException w:name="Light Grid Accent 6" w:uiPriority="62"/>
-    <w:lsdException w:name="Medium Shading 1 Accent 6" w:uiPriority="63"/>
-    <w:lsdException w:name="Medium Shading 2 Accent 6" w:uiPriority="64"/>
-    <w:lsdException w:name="Medium List 1 Accent 6" w:uiPriority="65"/>
-    <w:lsdException w:name="Medium List 2 Accent 6" w:uiPriority="66"/>
-    <w:lsdException w:name="Medium Grid 1 Accent 6" w:uiPriority="67"/>
-    <w:lsdException w:name="Medium Grid 2 Accent 6" w:uiPriority="68"/>
-    <w:lsdException w:name="Medium Grid 3 Accent 6" w:uiPriority="69"/>
-    <w:lsdException w:name="Dark List Accent 6" w:uiPriority="70"/>
-    <w:lsdException w:name="Colorful Shading Accent 6" w:uiPriority="71"/>
-    <w:lsdException w:name="Colorful List Accent 6" w:uiPriority="72"/>
-    <w:lsdException w:name="Colorful Grid Accent 6" w:uiPriority="73"/>
-    <w:lsdException w:name="Subtle Emphasis" w:uiPriority="19" w:qFormat="1"/>
-    <w:lsdException w:name="Intense Emphasis" w:uiPriority="21" w:qFormat="1"/>
-    <w:lsdException w:name="Subtle Reference" w:uiPriority="31" w:qFormat="1"/>
-    <w:lsdException w:name="Intense Reference" w:uiPriority="32" w:qFormat="1"/>
-    <w:lsdException w:name="Book Title" w:uiPriority="33" w:qFormat="1"/>
-    <w:lsdException w:name="Bibliography" w:semiHidden="1" w:uiPriority="37" w:unhideWhenUsed="1"/>
-    <w:lsdException w:name="TOC Heading" w:semiHidden="1" w:uiPriority="39" w:unhideWhenUsed="1" w:qFormat="1"/>
-    <w:lsdException w:name="Plain Table 1" w:uiPriority="41"/>
-    <w:lsdException w:name="Plain Table 2" w:uiPriority="42"/>
-    <w:lsdException w:name="Plain Table 3" w:uiPriority="43"/>
-    <w:lsdException w:name="Plain Table 4" w:uiPriority="44"/>
-    <w:lsdException w:name="Plain Table 5" w:uiPriority="45"/>
-    <w:lsdException w:name="Grid Table Light" w:uiPriority="40"/>
-    <w:lsdException w:name="Grid Table 1 Light" w:uiPriority="46"/>
-    <w:lsdException w:name="Grid Table 2" w:uiPriority="47"/>
-    <w:lsdException w:name="Grid Table 3" w:uiPriority="48"/>
-    <w:lsdException w:name="Grid Table 4" w:uiPriority="49"/>
-    <w:lsdException w:name="Grid Table 5 Dark" w:uiPriority="50"/>
-    <w:lsdException w:name="Grid Table 6 Colorful" w:uiPriority="51"/>
-    <w:lsdException w:name="Grid Table 7 Colorful" w:uiPriority="52"/>
-    <w:lsdException w:name="Grid Table 1 Light Accent 1" w:uiPriority="46"/>
-    <w:lsdException w:name="Grid Table 2 Accent 1" w:uiPriority="47"/>
-    <w:lsdException w:name="Grid Table 3 Accent 1" w:uiPriority="48"/>
-    <w:lsdException w:name="Grid Table 4 Accent 1" w:uiPriority="49"/>
-    <w:lsdException w:name="Grid Table 5 Dark Accent 1" w:uiPriority="50"/>
-    <w:lsdException w:name="Grid Table 6 Colorful Accent 1" w:uiPriority="51"/>
-    <w:lsdException w:name="Grid Table 7 Colorful Accent 1" w:uiPriority="52"/>
-    <w:lsdException w:name="Grid Table 1 Light Accent 2" w:uiPriority="46"/>
-    <w:lsdException w:name="Grid Table 2 Accent 2" w:uiPriority="47"/>
-    <w:lsdException w:name="Grid Table 3 Accent 2" w:uiPriority="48"/>
-    <w:lsdException w:name="Grid Table 4 Accent 2" w:uiPriority="49"/>
-    <w:lsdException w:name="Grid Table 5 Dark Accent 2" w:uiPriority="50"/>
-    <w:lsdException w:name="Grid Table 6 Colorful Accent 2" w:uiPriority="51"/>
-    <w:lsdException w:name="Grid Table 7 Colorful Accent 2" w:uiPriority="52"/>
-    <w:lsdException w:name="Grid Table 1 Light Accent 3" w:uiPriority="46"/>
-    <w:lsdException w:name="Grid Table 2 Accent 3" w:uiPriority="47"/>
-    <w:lsdException w:name="Grid Table 3 Accent 3" w:uiPriority="48"/>
-    <w:lsdException w:name="Grid Table 4 Accent 3" w:uiPriority="49"/>
-    <w:lsdException w:name="Grid Table 5 Dark Accent 3" w:uiPriority="50"/>
-    <w:lsdException w:name="Grid Table 6 Colorful Accent 3" w:uiPriority="51"/>
-    <w:lsdException w:name="Grid Table 7 Colorful Accent 3" w:uiPriority="52"/>
-    <w:lsdException w:name="Grid Table 1 Light Accent 4" w:uiPriority="46"/>
-    <w:lsdException w:name="Grid Table 2 Accent 4" w:uiPriority="47"/>
-    <w:lsdException w:name="Grid Table 3 Accent 4" w:uiPriority="48"/>
-    <w:lsdException w:name="Grid Table 4 Accent 4" w:uiPriority="49"/>
-    <w:lsdException w:name="Grid Table 5 Dark Accent 4" w:uiPriority="50"/>
-    <w:lsdException w:name="Grid Table 6 Colorful Accent 4" w:uiPriority="51"/>
-    <w:lsdException w:name="Grid Table 7 Colorful Accent 4" w:uiPriority="52"/>
-    <w:lsdException w:name="Grid Table 1 Light Accent 5" w:uiPriority="46"/>
-    <w:lsdException w:name="Grid Table 2 Accent 5" w:uiPriority="47"/>
-    <w:lsdException w:name="Grid Table 3 Accent 5" w:uiPriority="48"/>
-    <w:lsdException w:name="Grid Table 4 Accent 5" w:uiPriority="49"/>
-    <w:lsdException w:name="Grid Table 5 Dark Accent 5" w:uiPriority="50"/>
-    <w:lsdException w:name="Grid Table 6 Colorful Accent 5" w:uiPriority="51"/>
-    <w:lsdException w:name="Grid Table 7 Colorful Accent 5" w:uiPriority="52"/>
-    <w:lsdException w:name="Grid Table 1 Light Accent 6" w:uiPriority="46"/>
-    <w:lsdException w:name="Grid Table 2 Accent 6" w:uiPriority="47"/>
-    <w:lsdException w:name="Grid Table 3 Accent 6" w:uiPriority="48"/>
-    <w:lsdException w:name="Grid Table 4 Accent 6" w:uiPriority="49"/>
-    <w:lsdException w:name="Grid Table 5 Dark Accent 6" w:uiPriority="50"/>
-    <w:lsdException w:name="Grid Table 6 Colorful Accent 6" w:uiPriority="51"/>
-    <w:lsdException w:name="Grid Table 7 Colorful Accent 6" w:uiPriority="52"/>
-    <w:lsdException w:name="List Table 1 Light" w:uiPriority="46"/>
-    <w:lsdException w:name="List Table 2" w:uiPriority="47"/>
-    <w:lsdException w:name="List Table 3" w:uiPriority="48"/>
-    <w:lsdException w:name="List Table 4" w:uiPriority="49"/>
-    <w:lsdException w:name="List Table 5 Dark" w:uiPriority="50"/>
-    <w:lsdException w:name="List Table 6 Colorful" w:uiPriority="51"/>
-    <w:lsdException w:name="List Table 7 Colorful" w:uiPriority="52"/>
-    <w:lsdException w:name="List Table 1 Light Accent 1" w:uiPriority="46"/>
-    <w:lsdException w:name="List Table 2 Accent 1" w:uiPriority="47"/>
-    <w:lsdException w:name="List Table 3 Accent 1" w:uiPriority="48"/>
-    <w:lsdException w:name="List Table 4 Accent 1" w:uiPriority="49"/>
-    <w:lsdException w:name="List Table 5 Dark Accent 1" w:uiPriority="50"/>
-    <w:lsdException w:name="List Table 6 Colorful Accent 1" w:uiPriority="51"/>
-    <w:lsdException w:name="List Table 7 Colorful Accent 1" w:uiPriority="52"/>
-    <w:lsdException w:name="List Table 1 Light Accent 2" w:uiPriority="46"/>
-    <w:lsdException w:name="List Table 2 Accent 2" w:uiPriority="47"/>
-    <w:lsdException w:name="List Table 3 Accent 2" w:uiPriority="48"/>
-    <w:lsdException w:name="List Table 4 Accent 2" w:uiPriority="49"/>
-    <w:lsdException w:name="List Table 5 Dark Accent 2" w:uiPriority="50"/>
-    <w:lsdException w:name="List Table 6 Colorful Accent 2" w:uiPriority="51"/>
-    <w:lsdException w:name="List Table 7 Colorful Accent 2" w:uiPriority="52"/>
-    <w:lsdException w:name="List Table 1 Light Accent 3" w:uiPriority="46"/>
-    <w:lsdException w:name="List Table 2 Accent 3" w:uiPriority="47"/>
-    <w:lsdException w:name="List Table 3 Accent 3" w:uiPriority="48"/>
-    <w:lsdException w:name="List Table 4 Accent 3" w:uiPriority="49"/>
-    <w:lsdException w:name="List Table 5 Dark Accent 3" w:uiPriority="50"/>
-    <w:lsdException w:name="List Table 6 Colorful Accent 3" w:uiPriority="51"/>
-    <w:lsdException w:name="List Table 7 Colorful Accent 3" w:uiPriority="52"/>
-    <w:lsdException w:name="List Table 1 Light Accent 4" w:uiPriority="46"/>
-    <w:lsdException w:name="List Table 2 Accent 4" w:uiPriority="47"/>
-    <w:lsdException w:name="List Table 3 Accent 4" w:uiPriority="48"/>
-    <w:lsdException w:name="List Table 4 Accent 4" w:uiPriority="49"/>
-    <w:lsdException w:name="List Table 5 Dark Accent 4" w:uiPriority="50"/>
-    <w:lsdException w:name="List Table 6 Colorful Accent 4" w:uiPriority="51"/>
-    <w:lsdException w:name="List Table 7 Colorful Accent 4" w:uiPriority="52"/>
-    <w:lsdException w:name="List Table 1 Light Accent 5" w:uiPriority="46"/>
-    <w:lsdException w:name="List Table 2 Accent 5" w:uiPriority="47"/>
-    <w:lsdException w:name="List Table 3 Accent 5" w:uiPriority="48"/>
-    <w:lsdException w:name="List Table 4 Accent 5" w:uiPriority="49"/>
-    <w:lsdException w:name="List Table 5 Dark Accent 5" w:uiPriority="50"/>
-    <w:lsdException w:name="List Table 6 Colorful Accent 5" w:uiPriority="51"/>
-    <w:lsdException w:name="List Table 7 Colorful Accent 5" w:uiPriority="52"/>
-    <w:lsdException w:name="List Table 1 Light Accent 6" w:uiPriority="46"/>
-    <w:lsdException w:name="List Table 2 Accent 6" w:uiPriority="47"/>
-    <w:lsdException w:name="List Table 3 Accent 6" w:uiPriority="48"/>
-    <w:lsdException w:name="List Table 4 Accent 6" w:uiPriority="49"/>
-    <w:lsdException w:name="List Table 5 Dark Accent 6" w:uiPriority="50"/>
-    <w:lsdException w:name="List Table 6 Colorful Accent 6" w:uiPriority="51"/>
-    <w:lsdException w:name="List Table 7 Colorful Accent 6" w:uiPriority="52"/>
-    <w:lsdException w:name="Mention" w:semiHidden="1" w:unhideWhenUsed="1"/>
-    <w:lsdException w:name="Smart Hyperlink" w:semiHidden="1" w:unhideWhenUsed="1"/>
-    <w:lsdException w:name="Hashtag" w:semiHidden="1" w:unhideWhenUsed="1"/>
-    <w:lsdException w:name="Unresolved Mention" w:semiHidden="1" w:unhideWhenUsed="1"/>
-    <w:lsdException w:name="Smart Link" w:semiHidden="1" w:unhideWhenUsed="1"/>
+  <w:latentStyles w:defLockedState="0" w:defUIPriority="99" w:defSemiHidden="1" w:defUnhideWhenUsed="1" w:defQFormat="0" w:count="267">
+    <w:lsdException w:name="Normal" w:semiHidden="0" w:uiPriority="0" w:unhideWhenUsed="0" w:qFormat="1"/>
+    <w:lsdException w:name="heading 1" w:semiHidden="0" w:uiPriority="9" w:unhideWhenUsed="0" w:qFormat="1"/>
+    <w:lsdException w:name="heading 2" w:uiPriority="9" w:qFormat="1"/>
+    <w:lsdException w:name="heading 3" w:uiPriority="9" w:qFormat="1"/>
+    <w:lsdException w:name="heading 4" w:uiPriority="9" w:qFormat="1"/>
+    <w:lsdException w:name="heading 5" w:uiPriority="9" w:qFormat="1"/>
+    <w:lsdException w:name="heading 6" w:uiPriority="9" w:qFormat="1"/>
+    <w:lsdException w:name="heading 7" w:uiPriority="9" w:qFormat="1"/>
+    <w:lsdException w:name="heading 8" w:uiPriority="9" w:qFormat="1"/>
+    <w:lsdException w:name="heading 9" w:uiPriority="9" w:qFormat="1"/>
+    <w:lsdException w:name="toc 1" w:uiPriority="39"/>
+    <w:lsdException w:name="toc 2" w:uiPriority="39"/>
+    <w:lsdException w:name="toc 3" w:uiPriority="39"/>
+    <w:lsdException w:name="toc 4" w:uiPriority="39"/>
+    <w:lsdException w:name="toc 5" w:uiPriority="39"/>
+    <w:lsdException w:name="toc 6" w:uiPriority="39"/>
+    <w:lsdException w:name="toc 7" w:uiPriority="39"/>
+    <w:lsdException w:name="toc 8" w:uiPriority="39"/>
+    <w:lsdException w:name="toc 9" w:uiPriority="39"/>
+    <w:lsdException w:name="caption" w:uiPriority="35" w:qFormat="1"/>
+    <w:lsdException w:name="Title" w:semiHidden="0" w:uiPriority="0" w:unhideWhenUsed="0" w:qFormat="1"/>
+    <w:lsdException w:name="Default Paragraph Font" w:uiPriority="1"/>
+    <w:lsdException w:name="Body Text" w:uiPriority="0"/>
+    <w:lsdException w:name="Subtitle" w:semiHidden="0" w:uiPriority="11" w:unhideWhenUsed="0" w:qFormat="1"/>
+    <w:lsdException w:name="Body Text 3" w:uiPriority="0"/>
+    <w:lsdException w:name="Strong" w:semiHidden="0" w:uiPriority="22" w:unhideWhenUsed="0" w:qFormat="1"/>
+    <w:lsdException w:name="Emphasis" w:semiHidden="0" w:uiPriority="20" w:unhideWhenUsed="0" w:qFormat="1"/>
+    <w:lsdException w:name="Table Grid" w:semiHidden="0" w:uiPriority="59" w:unhideWhenUsed="0"/>
+    <w:lsdException w:name="Placeholder Text" w:unhideWhenUsed="0"/>
+    <w:lsdException w:name="No Spacing" w:semiHidden="0" w:uiPriority="1" w:unhideWhenUsed="0" w:qFormat="1"/>
+    <w:lsdException w:name="Light Shading" w:semiHidden="0" w:uiPriority="60" w:unhideWhenUsed="0"/>
+    <w:lsdException w:name="Light List" w:semiHidden="0" w:uiPriority="61" w:unhideWhenUsed="0"/>
+    <w:lsdException w:name="Light Grid" w:semiHidden="0" w:uiPriority="62" w:unhideWhenUsed="0"/>
+    <w:lsdException w:name="Medium Shading 1" w:semiHidden="0" w:uiPriority="63" w:unhideWhenUsed="0"/>
+    <w:lsdException w:name="Medium Shading 2" w:semiHidden="0" w:uiPriority="64" w:unhideWhenUsed="0"/>
+    <w:lsdException w:name="Medium List 1" w:semiHidden="0" w:uiPriority="65" w:unhideWhenUsed="0"/>
+    <w:lsdException w:name="Medium List 2" w:semiHidden="0" w:uiPriority="66" w:unhideWhenUsed="0"/>
+    <w:lsdException w:name="Medium Grid 1" w:semiHidden="0" w:uiPriority="67" w:unhideWhenUsed="0"/>
+    <w:lsdException w:name="Medium Grid 2" w:semiHidden="0" w:uiPriority="68" w:unhideWhenUsed="0"/>
+    <w:lsdException w:name="Medium Grid 3" w:semiHidden="0" w:uiPriority="69" w:unhideWhenUsed="0"/>
+    <w:lsdException w:name="Dark List" w:semiHidden="0" w:uiPriority="70" w:unhideWhenUsed="0"/>
+    <w:lsdException w:name="Colorful Shading" w:semiHidden="0" w:uiPriority="71" w:unhideWhenUsed="0"/>
+    <w:lsdException w:name="Colorful List" w:semiHidden="0" w:uiPriority="72" w:unhideWhenUsed="0"/>
+    <w:lsdException w:name="Colorful Grid" w:semiHidden="0" w:uiPriority="73" w:unhideWhenUsed="0"/>
+    <w:lsdException w:name="Light Shading Accent 1" w:semiHidden="0" w:uiPriority="60" w:unhideWhenUsed="0"/>
+    <w:lsdException w:name="Light List Accent 1" w:semiHidden="0" w:uiPriority="61" w:unhideWhenUsed="0"/>
+    <w:lsdException w:name="Light Grid Accent 1" w:semiHidden="0" w:uiPriority="62" w:unhideWhenUsed="0"/>
+    <w:lsdException w:name="Medium Shading 1 Accent 1" w:semiHidden="0" w:uiPriority="63" w:unhideWhenUsed="0"/>
+    <w:lsdException w:name="Medium Shading 2 Accent 1" w:semiHidden="0" w:uiPriority="64" w:unhideWhenUsed="0"/>
+    <w:lsdException w:name="Medium List 1 Accent 1" w:semiHidden="0" w:uiPriority="65" w:unhideWhenUsed="0"/>
+    <w:lsdException w:name="Revision" w:unhideWhenUsed="0"/>
+    <w:lsdException w:name="List Paragraph" w:semiHidden="0" w:uiPriority="34" w:unhideWhenUsed="0" w:qFormat="1"/>
+    <w:lsdException w:name="Quote" w:semiHidden="0" w:uiPriority="29" w:unhideWhenUsed="0" w:qFormat="1"/>
+    <w:lsdException w:name="Intense Quote" w:semiHidden="0" w:uiPriority="30" w:unhideWhenUsed="0" w:qFormat="1"/>
+    <w:lsdException w:name="Medium List 2 Accent 1" w:semiHidden="0" w:uiPriority="66" w:unhideWhenUsed="0"/>
+    <w:lsdException w:name="Medium Grid 1 Accent 1" w:semiHidden="0" w:uiPriority="67" w:unhideWhenUsed="0"/>
+    <w:lsdException w:name="Medium Grid 2 Accent 1" w:semiHidden="0" w:uiPriority="68" w:unhideWhenUsed="0"/>
+    <w:lsdException w:name="Medium Grid 3 Accent 1" w:semiHidden="0" w:uiPriority="69" w:unhideWhenUsed="0"/>
+    <w:lsdException w:name="Dark List Accent 1" w:semiHidden="0" w:uiPriority="70" w:unhideWhenUsed="0"/>
+    <w:lsdException w:name="Colorful Shading Accent 1" w:semiHidden="0" w:uiPriority="71" w:unhideWhenUsed="0"/>
+    <w:lsdException w:name="Colorful List Accent 1" w:semiHidden="0" w:uiPriority="72" w:unhideWhenUsed="0"/>
+    <w:lsdException w:name="Colorful Grid Accent 1" w:semiHidden="0" w:uiPriority="73" w:unhideWhenUsed="0"/>
+    <w:lsdException w:name="Light Shading Accent 2" w:semiHidden="0" w:uiPriority="60" w:unhideWhenUsed="0"/>
+    <w:lsdException w:name="Light List Accent 2" w:semiHidden="0" w:uiPriority="61" w:unhideWhenUsed="0"/>
+    <w:lsdException w:name="Light Grid Accent 2" w:semiHidden="0" w:uiPriority="62" w:unhideWhenUsed="0"/>
+    <w:lsdException w:name="Medium Shading 1 Accent 2" w:semiHidden="0" w:uiPriority="63" w:unhideWhenUsed="0"/>
+    <w:lsdException w:name="Medium Shading 2 Accent 2" w:semiHidden="0" w:uiPriority="64" w:unhideWhenUsed="0"/>
+    <w:lsdException w:name="Medium List 1 Accent 2" w:semiHidden="0" w:uiPriority="65" w:unhideWhenUsed="0"/>
+    <w:lsdException w:name="Medium List 2 Accent 2" w:semiHidden="0" w:uiPriority="66" w:unhideWhenUsed="0"/>
+    <w:lsdException w:name="Medium Grid 1 Accent 2" w:semiHidden="0" w:uiPriority="67" w:unhideWhenUsed="0"/>
+    <w:lsdException w:name="Medium Grid 2 Accent 2" w:semiHidden="0" w:uiPriority="68" w:unhideWhenUsed="0"/>
+    <w:lsdException w:name="Medium Grid 3 Accent 2" w:semiHidden="0" w:uiPriority="69" w:unhideWhenUsed="0"/>
+    <w:lsdException w:name="Dark List Accent 2" w:semiHidden="0" w:uiPriority="70" w:unhideWhenUsed="0"/>
+    <w:lsdException w:name="Colorful Shading Accent 2" w:semiHidden="0" w:uiPriority="71" w:unhideWhenUsed="0"/>
+    <w:lsdException w:name="Colorful List Accent 2" w:semiHidden="0" w:uiPriority="72" w:unhideWhenUsed="0"/>
+    <w:lsdException w:name="Colorful Grid Accent 2" w:semiHidden="0" w:uiPriority="73" w:unhideWhenUsed="0"/>
+    <w:lsdException w:name="Light Shading Accent 3" w:semiHidden="0" w:uiPriority="60" w:unhideWhenUsed="0"/>
+    <w:lsdException w:name="Light List Accent 3" w:semiHidden="0" w:uiPriority="61" w:unhideWhenUsed="0"/>
+    <w:lsdException w:name="Light Grid Accent 3" w:semiHidden="0" w:uiPriority="62" w:unhideWhenUsed="0"/>
+    <w:lsdException w:name="Medium Shading 1 Accent 3" w:semiHidden="0" w:uiPriority="63" w:unhideWhenUsed="0"/>
+    <w:lsdException w:name="Medium Shading 2 Accent 3" w:semiHidden="0" w:uiPriority="64" w:unhideWhenUsed="0"/>
+    <w:lsdException w:name="Medium List 1 Accent 3" w:semiHidden="0" w:uiPriority="65" w:unhideWhenUsed="0"/>
+    <w:lsdException w:name="Medium List 2 Accent 3" w:semiHidden="0" w:uiPriority="66" w:unhideWhenUsed="0"/>
+    <w:lsdException w:name="Medium Grid 1 Accent 3" w:semiHidden="0" w:uiPriority="67" w:unhideWhenUsed="0"/>
+    <w:lsdException w:name="Medium Grid 2 Accent 3" w:semiHidden="0" w:uiPriority="68" w:unhideWhenUsed="0"/>
+    <w:lsdException w:name="Medium Grid 3 Accent 3" w:semiHidden="0" w:uiPriority="69" w:unhideWhenUsed="0"/>
+    <w:lsdException w:name="Dark List Accent 3" w:semiHidden="0" w:uiPriority="70" w:unhideWhenUsed="0"/>
+    <w:lsdException w:name="Colorful Shading Accent 3" w:semiHidden="0" w:uiPriority="71" w:unhideWhenUsed="0"/>
+    <w:lsdException w:name="Colorful List Accent 3" w:semiHidden="0" w:uiPriority="72" w:unhideWhenUsed="0"/>
+    <w:lsdException w:name="Colorful Grid Accent 3" w:semiHidden="0" w:uiPriority="73" w:unhideWhenUsed="0"/>
+    <w:lsdException w:name="Light Shading Accent 4" w:semiHidden="0" w:uiPriority="60" w:unhideWhenUsed="0"/>
+    <w:lsdException w:name="Light List Accent 4" w:semiHidden="0" w:uiPriority="61" w:unhideWhenUsed="0"/>
+    <w:lsdException w:name="Light Grid Accent 4" w:semiHidden="0" w:uiPriority="62" w:unhideWhenUsed="0"/>
+    <w:lsdException w:name="Medium Shading 1 Accent 4" w:semiHidden="0" w:uiPriority="63" w:unhideWhenUsed="0"/>
+    <w:lsdException w:name="Medium Shading 2 Accent 4" w:semiHidden="0" w:uiPriority="64" w:unhideWhenUsed="0"/>
+    <w:lsdException w:name="Medium List 1 Accent 4" w:semiHidden="0" w:uiPriority="65" w:unhideWhenUsed="0"/>
+    <w:lsdException w:name="Medium List 2 Accent 4" w:semiHidden="0" w:uiPriority="66" w:unhideWhenUsed="0"/>
+    <w:lsdException w:name="Medium Grid 1 Accent 4" w:semiHidden="0" w:uiPriority="67" w:unhideWhenUsed="0"/>
+    <w:lsdException w:name="Medium Grid 2 Accent 4" w:semiHidden="0" w:uiPriority="68" w:unhideWhenUsed="0"/>
+    <w:lsdException w:name="Medium Grid 3 Accent 4" w:semiHidden="0" w:uiPriority="69" w:unhideWhenUsed="0"/>
+    <w:lsdException w:name="Dark List Accent 4" w:semiHidden="0" w:uiPriority="70" w:unhideWhenUsed="0"/>
+    <w:lsdException w:name="Colorful Shading Accent 4" w:semiHidden="0" w:uiPriority="71" w:unhideWhenUsed="0"/>
+    <w:lsdException w:name="Colorful List Accent 4" w:semiHidden="0" w:uiPriority="72" w:unhideWhenUsed="0"/>
+    <w:lsdException w:name="Colorful Grid Accent 4" w:semiHidden="0" w:uiPriority="73" w:unhideWhenUsed="0"/>
+    <w:lsdException w:name="Light Shading Accent 5" w:semiHidden="0" w:uiPriority="60" w:unhideWhenUsed="0"/>
+    <w:lsdException w:name="Light List Accent 5" w:semiHidden="0" w:uiPriority="61" w:unhideWhenUsed="0"/>
+    <w:lsdException w:name="Light Grid Accent 5" w:semiHidden="0" w:uiPriority="62" w:unhideWhenUsed="0"/>
+    <w:lsdException w:name="Medium Shading 1 Accent 5" w:semiHidden="0" w:uiPriority="63" w:unhideWhenUsed="0"/>
+    <w:lsdException w:name="Medium Shading 2 Accent 5" w:semiHidden="0" w:uiPriority="64" w:unhideWhenUsed="0"/>
+    <w:lsdException w:name="Medium List 1 Accent 5" w:semiHidden="0" w:uiPriority="65" w:unhideWhenUsed="0"/>
+    <w:lsdException w:name="Medium List 2 Accent 5" w:semiHidden="0" w:uiPriority="66" w:unhideWhenUsed="0"/>
+    <w:lsdException w:name="Medium Grid 1 Accent 5" w:semiHidden="0" w:uiPriority="67" w:unhideWhenUsed="0"/>
+    <w:lsdException w:name="Medium Grid 2 Accent 5" w:semiHidden="0" w:uiPriority="68" w:unhideWhenUsed="0"/>
+    <w:lsdException w:name="Medium Grid 3 Accent 5" w:semiHidden="0" w:uiPriority="69" w:unhideWhenUsed="0"/>
+    <w:lsdException w:name="Dark List Accent 5" w:semiHidden="0" w:uiPriority="70" w:unhideWhenUsed="0"/>
+    <w:lsdException w:name="Colorful Shading Accent 5" w:semiHidden="0" w:uiPriority="71" w:unhideWhenUsed="0"/>
+    <w:lsdException w:name="Colorful List Accent 5" w:semiHidden="0" w:uiPriority="72" w:unhideWhenUsed="0"/>
+    <w:lsdException w:name="Colorful Grid Accent 5" w:semiHidden="0" w:uiPriority="73" w:unhideWhenUsed="0"/>
+    <w:lsdException w:name="Light Shading Accent 6" w:semiHidden="0" w:uiPriority="60" w:unhideWhenUsed="0"/>
+    <w:lsdException w:name="Light List Accent 6" w:semiHidden="0" w:uiPriority="61" w:unhideWhenUsed="0"/>
+    <w:lsdException w:name="Light Grid Accent 6" w:semiHidden="0" w:uiPriority="62" w:unhideWhenUsed="0"/>
+    <w:lsdException w:name="Medium Shading 1 Accent 6" w:semiHidden="0" w:uiPriority="63" w:unhideWhenUsed="0"/>
+    <w:lsdException w:name="Medium Shading 2 Accent 6" w:semiHidden="0" w:uiPriority="64" w:unhideWhenUsed="0"/>
+    <w:lsdException w:name="Medium List 1 Accent 6" w:semiHidden="0" w:uiPriority="65" w:unhideWhenUsed="0"/>
+    <w:lsdException w:name="Medium List 2 Accent 6" w:semiHidden="0" w:uiPriority="66" w:unhideWhenUsed="0"/>
+    <w:lsdException w:name="Medium Grid 1 Accent 6" w:semiHidden="0" w:uiPriority="67" w:unhideWhenUsed="0"/>
+    <w:lsdException w:name="Medium Grid 2 Accent 6" w:semiHidden="0" w:uiPriority="68" w:unhideWhenUsed="0"/>
+    <w:lsdException w:name="Medium Grid 3 Accent 6" w:semiHidden="0" w:uiPriority="69" w:unhideWhenUsed="0"/>
+    <w:lsdException w:name="Dark List Accent 6" w:semiHidden="0" w:uiPriority="70" w:unhideWhenUsed="0"/>
+    <w:lsdException w:name="Colorful Shading Accent 6" w:semiHidden="0" w:uiPriority="71" w:unhideWhenUsed="0"/>
+    <w:lsdException w:name="Colorful List Accent 6" w:semiHidden="0" w:uiPriority="72" w:unhideWhenUsed="0"/>
+    <w:lsdException w:name="Colorful Grid Accent 6" w:semiHidden="0" w:uiPriority="73" w:unhideWhenUsed="0"/>
+    <w:lsdException w:name="Subtle Emphasis" w:semiHidden="0" w:uiPriority="19" w:unhideWhenUsed="0" w:qFormat="1"/>
+    <w:lsdException w:name="Intense Emphasis" w:semiHidden="0" w:uiPriority="21" w:unhideWhenUsed="0" w:qFormat="1"/>
+    <w:lsdException w:name="Subtle Reference" w:semiHidden="0" w:uiPriority="31" w:unhideWhenUsed="0" w:qFormat="1"/>
+    <w:lsdException w:name="Intense Reference" w:semiHidden="0" w:uiPriority="32" w:unhideWhenUsed="0" w:qFormat="1"/>
+    <w:lsdException w:name="Book Title" w:semiHidden="0" w:uiPriority="33" w:unhideWhenUsed="0" w:qFormat="1"/>
+    <w:lsdException w:name="Bibliography" w:uiPriority="37"/>
+    <w:lsdException w:name="TOC Heading" w:uiPriority="39" w:qFormat="1"/>
   </w:latentStyles>
   <w:style w:type="paragraph" w:default="1" w:styleId="Normal">
     <w:name w:val="Normal"/>
@@ -10947,6 +10638,7 @@
       <w14:ligatures w14:val="none"/>
     </w:rPr>
     <w:tblPr>
+      <w:tblInd w:w="0" w:type="dxa"/>
       <w:tblBorders>
         <w:top w:val="single" w:sz="4" w:space="0" w:color="auto"/>
         <w:left w:val="single" w:sz="4" w:space="0" w:color="auto"/>
@@ -10955,6 +10647,367 @@
         <w:insideH w:val="single" w:sz="4" w:space="0" w:color="auto"/>
         <w:insideV w:val="single" w:sz="4" w:space="0" w:color="auto"/>
       </w:tblBorders>
+      <w:tblCellMar>
+        <w:top w:w="0" w:type="dxa"/>
+        <w:left w:w="108" w:type="dxa"/>
+        <w:bottom w:w="0" w:type="dxa"/>
+        <w:right w:w="108" w:type="dxa"/>
+      </w:tblCellMar>
+    </w:tblPr>
+  </w:style>
+</w:styles>
+</file>
+
+<file path=word/stylesWithEffects.xml><?xml version="1.0" encoding="utf-8"?>
+<w:styles xmlns:wpc="http://schemas.microsoft.com/office/word/2010/wordprocessingCanvas" xmlns:mc="http://schemas.openxmlformats.org/markup-compatibility/2006" xmlns:o="urn:schemas-microsoft-com:office:office" xmlns:r="http://schemas.openxmlformats.org/officeDocument/2006/relationships" xmlns:m="http://schemas.openxmlformats.org/officeDocument/2006/math" xmlns:v="urn:schemas-microsoft-com:vml" xmlns:wp14="http://schemas.microsoft.com/office/word/2010/wordprocessingDrawing" xmlns:wp="http://schemas.openxmlformats.org/drawingml/2006/wordprocessingDrawing" xmlns:w10="urn:schemas-microsoft-com:office:word" xmlns:w="http://schemas.openxmlformats.org/wordprocessingml/2006/main" xmlns:w14="http://schemas.microsoft.com/office/word/2010/wordml" xmlns:wpg="http://schemas.microsoft.com/office/word/2010/wordprocessingGroup" xmlns:wpi="http://schemas.microsoft.com/office/word/2010/wordprocessingInk" xmlns:wne="http://schemas.microsoft.com/office/word/2006/wordml" xmlns:wps="http://schemas.microsoft.com/office/word/2010/wordprocessingShape" mc:Ignorable="w14 wp14">
+  <w:docDefaults>
+    <w:rPrDefault>
+      <w:rPr>
+        <w:rFonts w:asciiTheme="minorHAnsi" w:eastAsiaTheme="minorHAnsi" w:hAnsiTheme="minorHAnsi" w:cstheme="minorBidi"/>
+        <w:kern w:val="2"/>
+        <w:sz w:val="24"/>
+        <w:szCs w:val="24"/>
+        <w:lang w:val="en-IN" w:eastAsia="en-US" w:bidi="ar-SA"/>
+        <w14:ligatures w14:val="standardContextual"/>
+      </w:rPr>
+    </w:rPrDefault>
+    <w:pPrDefault/>
+  </w:docDefaults>
+  <w:latentStyles w:defLockedState="0" w:defUIPriority="99" w:defSemiHidden="1" w:defUnhideWhenUsed="1" w:defQFormat="0" w:count="267">
+    <w:lsdException w:name="Normal" w:semiHidden="0" w:uiPriority="0" w:unhideWhenUsed="0" w:qFormat="1"/>
+    <w:lsdException w:name="heading 1" w:semiHidden="0" w:uiPriority="9" w:unhideWhenUsed="0" w:qFormat="1"/>
+    <w:lsdException w:name="heading 2" w:uiPriority="9" w:qFormat="1"/>
+    <w:lsdException w:name="heading 3" w:uiPriority="9" w:qFormat="1"/>
+    <w:lsdException w:name="heading 4" w:uiPriority="9" w:qFormat="1"/>
+    <w:lsdException w:name="heading 5" w:uiPriority="9" w:qFormat="1"/>
+    <w:lsdException w:name="heading 6" w:uiPriority="9" w:qFormat="1"/>
+    <w:lsdException w:name="heading 7" w:uiPriority="9" w:qFormat="1"/>
+    <w:lsdException w:name="heading 8" w:uiPriority="9" w:qFormat="1"/>
+    <w:lsdException w:name="heading 9" w:uiPriority="9" w:qFormat="1"/>
+    <w:lsdException w:name="toc 1" w:uiPriority="39"/>
+    <w:lsdException w:name="toc 2" w:uiPriority="39"/>
+    <w:lsdException w:name="toc 3" w:uiPriority="39"/>
+    <w:lsdException w:name="toc 4" w:uiPriority="39"/>
+    <w:lsdException w:name="toc 5" w:uiPriority="39"/>
+    <w:lsdException w:name="toc 6" w:uiPriority="39"/>
+    <w:lsdException w:name="toc 7" w:uiPriority="39"/>
+    <w:lsdException w:name="toc 8" w:uiPriority="39"/>
+    <w:lsdException w:name="toc 9" w:uiPriority="39"/>
+    <w:lsdException w:name="caption" w:uiPriority="35" w:qFormat="1"/>
+    <w:lsdException w:name="Title" w:semiHidden="0" w:uiPriority="0" w:unhideWhenUsed="0" w:qFormat="1"/>
+    <w:lsdException w:name="Default Paragraph Font" w:uiPriority="1"/>
+    <w:lsdException w:name="Body Text" w:uiPriority="0"/>
+    <w:lsdException w:name="Subtitle" w:semiHidden="0" w:uiPriority="11" w:unhideWhenUsed="0" w:qFormat="1"/>
+    <w:lsdException w:name="Body Text 3" w:uiPriority="0"/>
+    <w:lsdException w:name="Strong" w:semiHidden="0" w:uiPriority="22" w:unhideWhenUsed="0" w:qFormat="1"/>
+    <w:lsdException w:name="Emphasis" w:semiHidden="0" w:uiPriority="20" w:unhideWhenUsed="0" w:qFormat="1"/>
+    <w:lsdException w:name="Table Grid" w:semiHidden="0" w:uiPriority="59" w:unhideWhenUsed="0"/>
+    <w:lsdException w:name="Placeholder Text" w:unhideWhenUsed="0"/>
+    <w:lsdException w:name="No Spacing" w:semiHidden="0" w:uiPriority="1" w:unhideWhenUsed="0" w:qFormat="1"/>
+    <w:lsdException w:name="Light Shading" w:semiHidden="0" w:uiPriority="60" w:unhideWhenUsed="0"/>
+    <w:lsdException w:name="Light List" w:semiHidden="0" w:uiPriority="61" w:unhideWhenUsed="0"/>
+    <w:lsdException w:name="Light Grid" w:semiHidden="0" w:uiPriority="62" w:unhideWhenUsed="0"/>
+    <w:lsdException w:name="Medium Shading 1" w:semiHidden="0" w:uiPriority="63" w:unhideWhenUsed="0"/>
+    <w:lsdException w:name="Medium Shading 2" w:semiHidden="0" w:uiPriority="64" w:unhideWhenUsed="0"/>
+    <w:lsdException w:name="Medium List 1" w:semiHidden="0" w:uiPriority="65" w:unhideWhenUsed="0"/>
+    <w:lsdException w:name="Medium List 2" w:semiHidden="0" w:uiPriority="66" w:unhideWhenUsed="0"/>
+    <w:lsdException w:name="Medium Grid 1" w:semiHidden="0" w:uiPriority="67" w:unhideWhenUsed="0"/>
+    <w:lsdException w:name="Medium Grid 2" w:semiHidden="0" w:uiPriority="68" w:unhideWhenUsed="0"/>
+    <w:lsdException w:name="Medium Grid 3" w:semiHidden="0" w:uiPriority="69" w:unhideWhenUsed="0"/>
+    <w:lsdException w:name="Dark List" w:semiHidden="0" w:uiPriority="70" w:unhideWhenUsed="0"/>
+    <w:lsdException w:name="Colorful Shading" w:semiHidden="0" w:uiPriority="71" w:unhideWhenUsed="0"/>
+    <w:lsdException w:name="Colorful List" w:semiHidden="0" w:uiPriority="72" w:unhideWhenUsed="0"/>
+    <w:lsdException w:name="Colorful Grid" w:semiHidden="0" w:uiPriority="73" w:unhideWhenUsed="0"/>
+    <w:lsdException w:name="Light Shading Accent 1" w:semiHidden="0" w:uiPriority="60" w:unhideWhenUsed="0"/>
+    <w:lsdException w:name="Light List Accent 1" w:semiHidden="0" w:uiPriority="61" w:unhideWhenUsed="0"/>
+    <w:lsdException w:name="Light Grid Accent 1" w:semiHidden="0" w:uiPriority="62" w:unhideWhenUsed="0"/>
+    <w:lsdException w:name="Medium Shading 1 Accent 1" w:semiHidden="0" w:uiPriority="63" w:unhideWhenUsed="0"/>
+    <w:lsdException w:name="Medium Shading 2 Accent 1" w:semiHidden="0" w:uiPriority="64" w:unhideWhenUsed="0"/>
+    <w:lsdException w:name="Medium List 1 Accent 1" w:semiHidden="0" w:uiPriority="65" w:unhideWhenUsed="0"/>
+    <w:lsdException w:name="Revision" w:unhideWhenUsed="0"/>
+    <w:lsdException w:name="List Paragraph" w:semiHidden="0" w:uiPriority="34" w:unhideWhenUsed="0" w:qFormat="1"/>
+    <w:lsdException w:name="Quote" w:semiHidden="0" w:uiPriority="29" w:unhideWhenUsed="0" w:qFormat="1"/>
+    <w:lsdException w:name="Intense Quote" w:semiHidden="0" w:uiPriority="30" w:unhideWhenUsed="0" w:qFormat="1"/>
+    <w:lsdException w:name="Medium List 2 Accent 1" w:semiHidden="0" w:uiPriority="66" w:unhideWhenUsed="0"/>
+    <w:lsdException w:name="Medium Grid 1 Accent 1" w:semiHidden="0" w:uiPriority="67" w:unhideWhenUsed="0"/>
+    <w:lsdException w:name="Medium Grid 2 Accent 1" w:semiHidden="0" w:uiPriority="68" w:unhideWhenUsed="0"/>
+    <w:lsdException w:name="Medium Grid 3 Accent 1" w:semiHidden="0" w:uiPriority="69" w:unhideWhenUsed="0"/>
+    <w:lsdException w:name="Dark List Accent 1" w:semiHidden="0" w:uiPriority="70" w:unhideWhenUsed="0"/>
+    <w:lsdException w:name="Colorful Shading Accent 1" w:semiHidden="0" w:uiPriority="71" w:unhideWhenUsed="0"/>
+    <w:lsdException w:name="Colorful List Accent 1" w:semiHidden="0" w:uiPriority="72" w:unhideWhenUsed="0"/>
+    <w:lsdException w:name="Colorful Grid Accent 1" w:semiHidden="0" w:uiPriority="73" w:unhideWhenUsed="0"/>
+    <w:lsdException w:name="Light Shading Accent 2" w:semiHidden="0" w:uiPriority="60" w:unhideWhenUsed="0"/>
+    <w:lsdException w:name="Light List Accent 2" w:semiHidden="0" w:uiPriority="61" w:unhideWhenUsed="0"/>
+    <w:lsdException w:name="Light Grid Accent 2" w:semiHidden="0" w:uiPriority="62" w:unhideWhenUsed="0"/>
+    <w:lsdException w:name="Medium Shading 1 Accent 2" w:semiHidden="0" w:uiPriority="63" w:unhideWhenUsed="0"/>
+    <w:lsdException w:name="Medium Shading 2 Accent 2" w:semiHidden="0" w:uiPriority="64" w:unhideWhenUsed="0"/>
+    <w:lsdException w:name="Medium List 1 Accent 2" w:semiHidden="0" w:uiPriority="65" w:unhideWhenUsed="0"/>
+    <w:lsdException w:name="Medium List 2 Accent 2" w:semiHidden="0" w:uiPriority="66" w:unhideWhenUsed="0"/>
+    <w:lsdException w:name="Medium Grid 1 Accent 2" w:semiHidden="0" w:uiPriority="67" w:unhideWhenUsed="0"/>
+    <w:lsdException w:name="Medium Grid 2 Accent 2" w:semiHidden="0" w:uiPriority="68" w:unhideWhenUsed="0"/>
+    <w:lsdException w:name="Medium Grid 3 Accent 2" w:semiHidden="0" w:uiPriority="69" w:unhideWhenUsed="0"/>
+    <w:lsdException w:name="Dark List Accent 2" w:semiHidden="0" w:uiPriority="70" w:unhideWhenUsed="0"/>
+    <w:lsdException w:name="Colorful Shading Accent 2" w:semiHidden="0" w:uiPriority="71" w:unhideWhenUsed="0"/>
+    <w:lsdException w:name="Colorful List Accent 2" w:semiHidden="0" w:uiPriority="72" w:unhideWhenUsed="0"/>
+    <w:lsdException w:name="Colorful Grid Accent 2" w:semiHidden="0" w:uiPriority="73" w:unhideWhenUsed="0"/>
+    <w:lsdException w:name="Light Shading Accent 3" w:semiHidden="0" w:uiPriority="60" w:unhideWhenUsed="0"/>
+    <w:lsdException w:name="Light List Accent 3" w:semiHidden="0" w:uiPriority="61" w:unhideWhenUsed="0"/>
+    <w:lsdException w:name="Light Grid Accent 3" w:semiHidden="0" w:uiPriority="62" w:unhideWhenUsed="0"/>
+    <w:lsdException w:name="Medium Shading 1 Accent 3" w:semiHidden="0" w:uiPriority="63" w:unhideWhenUsed="0"/>
+    <w:lsdException w:name="Medium Shading 2 Accent 3" w:semiHidden="0" w:uiPriority="64" w:unhideWhenUsed="0"/>
+    <w:lsdException w:name="Medium List 1 Accent 3" w:semiHidden="0" w:uiPriority="65" w:unhideWhenUsed="0"/>
+    <w:lsdException w:name="Medium List 2 Accent 3" w:semiHidden="0" w:uiPriority="66" w:unhideWhenUsed="0"/>
+    <w:lsdException w:name="Medium Grid 1 Accent 3" w:semiHidden="0" w:uiPriority="67" w:unhideWhenUsed="0"/>
+    <w:lsdException w:name="Medium Grid 2 Accent 3" w:semiHidden="0" w:uiPriority="68" w:unhideWhenUsed="0"/>
+    <w:lsdException w:name="Medium Grid 3 Accent 3" w:semiHidden="0" w:uiPriority="69" w:unhideWhenUsed="0"/>
+    <w:lsdException w:name="Dark List Accent 3" w:semiHidden="0" w:uiPriority="70" w:unhideWhenUsed="0"/>
+    <w:lsdException w:name="Colorful Shading Accent 3" w:semiHidden="0" w:uiPriority="71" w:unhideWhenUsed="0"/>
+    <w:lsdException w:name="Colorful List Accent 3" w:semiHidden="0" w:uiPriority="72" w:unhideWhenUsed="0"/>
+    <w:lsdException w:name="Colorful Grid Accent 3" w:semiHidden="0" w:uiPriority="73" w:unhideWhenUsed="0"/>
+    <w:lsdException w:name="Light Shading Accent 4" w:semiHidden="0" w:uiPriority="60" w:unhideWhenUsed="0"/>
+    <w:lsdException w:name="Light List Accent 4" w:semiHidden="0" w:uiPriority="61" w:unhideWhenUsed="0"/>
+    <w:lsdException w:name="Light Grid Accent 4" w:semiHidden="0" w:uiPriority="62" w:unhideWhenUsed="0"/>
+    <w:lsdException w:name="Medium Shading 1 Accent 4" w:semiHidden="0" w:uiPriority="63" w:unhideWhenUsed="0"/>
+    <w:lsdException w:name="Medium Shading 2 Accent 4" w:semiHidden="0" w:uiPriority="64" w:unhideWhenUsed="0"/>
+    <w:lsdException w:name="Medium List 1 Accent 4" w:semiHidden="0" w:uiPriority="65" w:unhideWhenUsed="0"/>
+    <w:lsdException w:name="Medium List 2 Accent 4" w:semiHidden="0" w:uiPriority="66" w:unhideWhenUsed="0"/>
+    <w:lsdException w:name="Medium Grid 1 Accent 4" w:semiHidden="0" w:uiPriority="67" w:unhideWhenUsed="0"/>
+    <w:lsdException w:name="Medium Grid 2 Accent 4" w:semiHidden="0" w:uiPriority="68" w:unhideWhenUsed="0"/>
+    <w:lsdException w:name="Medium Grid 3 Accent 4" w:semiHidden="0" w:uiPriority="69" w:unhideWhenUsed="0"/>
+    <w:lsdException w:name="Dark List Accent 4" w:semiHidden="0" w:uiPriority="70" w:unhideWhenUsed="0"/>
+    <w:lsdException w:name="Colorful Shading Accent 4" w:semiHidden="0" w:uiPriority="71" w:unhideWhenUsed="0"/>
+    <w:lsdException w:name="Colorful List Accent 4" w:semiHidden="0" w:uiPriority="72" w:unhideWhenUsed="0"/>
+    <w:lsdException w:name="Colorful Grid Accent 4" w:semiHidden="0" w:uiPriority="73" w:unhideWhenUsed="0"/>
+    <w:lsdException w:name="Light Shading Accent 5" w:semiHidden="0" w:uiPriority="60" w:unhideWhenUsed="0"/>
+    <w:lsdException w:name="Light List Accent 5" w:semiHidden="0" w:uiPriority="61" w:unhideWhenUsed="0"/>
+    <w:lsdException w:name="Light Grid Accent 5" w:semiHidden="0" w:uiPriority="62" w:unhideWhenUsed="0"/>
+    <w:lsdException w:name="Medium Shading 1 Accent 5" w:semiHidden="0" w:uiPriority="63" w:unhideWhenUsed="0"/>
+    <w:lsdException w:name="Medium Shading 2 Accent 5" w:semiHidden="0" w:uiPriority="64" w:unhideWhenUsed="0"/>
+    <w:lsdException w:name="Medium List 1 Accent 5" w:semiHidden="0" w:uiPriority="65" w:unhideWhenUsed="0"/>
+    <w:lsdException w:name="Medium List 2 Accent 5" w:semiHidden="0" w:uiPriority="66" w:unhideWhenUsed="0"/>
+    <w:lsdException w:name="Medium Grid 1 Accent 5" w:semiHidden="0" w:uiPriority="67" w:unhideWhenUsed="0"/>
+    <w:lsdException w:name="Medium Grid 2 Accent 5" w:semiHidden="0" w:uiPriority="68" w:unhideWhenUsed="0"/>
+    <w:lsdException w:name="Medium Grid 3 Accent 5" w:semiHidden="0" w:uiPriority="69" w:unhideWhenUsed="0"/>
+    <w:lsdException w:name="Dark List Accent 5" w:semiHidden="0" w:uiPriority="70" w:unhideWhenUsed="0"/>
+    <w:lsdException w:name="Colorful Shading Accent 5" w:semiHidden="0" w:uiPriority="71" w:unhideWhenUsed="0"/>
+    <w:lsdException w:name="Colorful List Accent 5" w:semiHidden="0" w:uiPriority="72" w:unhideWhenUsed="0"/>
+    <w:lsdException w:name="Colorful Grid Accent 5" w:semiHidden="0" w:uiPriority="73" w:unhideWhenUsed="0"/>
+    <w:lsdException w:name="Light Shading Accent 6" w:semiHidden="0" w:uiPriority="60" w:unhideWhenUsed="0"/>
+    <w:lsdException w:name="Light List Accent 6" w:semiHidden="0" w:uiPriority="61" w:unhideWhenUsed="0"/>
+    <w:lsdException w:name="Light Grid Accent 6" w:semiHidden="0" w:uiPriority="62" w:unhideWhenUsed="0"/>
+    <w:lsdException w:name="Medium Shading 1 Accent 6" w:semiHidden="0" w:uiPriority="63" w:unhideWhenUsed="0"/>
+    <w:lsdException w:name="Medium Shading 2 Accent 6" w:semiHidden="0" w:uiPriority="64" w:unhideWhenUsed="0"/>
+    <w:lsdException w:name="Medium List 1 Accent 6" w:semiHidden="0" w:uiPriority="65" w:unhideWhenUsed="0"/>
+    <w:lsdException w:name="Medium List 2 Accent 6" w:semiHidden="0" w:uiPriority="66" w:unhideWhenUsed="0"/>
+    <w:lsdException w:name="Medium Grid 1 Accent 6" w:semiHidden="0" w:uiPriority="67" w:unhideWhenUsed="0"/>
+    <w:lsdException w:name="Medium Grid 2 Accent 6" w:semiHidden="0" w:uiPriority="68" w:unhideWhenUsed="0"/>
+    <w:lsdException w:name="Medium Grid 3 Accent 6" w:semiHidden="0" w:uiPriority="69" w:unhideWhenUsed="0"/>
+    <w:lsdException w:name="Dark List Accent 6" w:semiHidden="0" w:uiPriority="70" w:unhideWhenUsed="0"/>
+    <w:lsdException w:name="Colorful Shading Accent 6" w:semiHidden="0" w:uiPriority="71" w:unhideWhenUsed="0"/>
+    <w:lsdException w:name="Colorful List Accent 6" w:semiHidden="0" w:uiPriority="72" w:unhideWhenUsed="0"/>
+    <w:lsdException w:name="Colorful Grid Accent 6" w:semiHidden="0" w:uiPriority="73" w:unhideWhenUsed="0"/>
+    <w:lsdException w:name="Subtle Emphasis" w:semiHidden="0" w:uiPriority="19" w:unhideWhenUsed="0" w:qFormat="1"/>
+    <w:lsdException w:name="Intense Emphasis" w:semiHidden="0" w:uiPriority="21" w:unhideWhenUsed="0" w:qFormat="1"/>
+    <w:lsdException w:name="Subtle Reference" w:semiHidden="0" w:uiPriority="31" w:unhideWhenUsed="0" w:qFormat="1"/>
+    <w:lsdException w:name="Intense Reference" w:semiHidden="0" w:uiPriority="32" w:unhideWhenUsed="0" w:qFormat="1"/>
+    <w:lsdException w:name="Book Title" w:semiHidden="0" w:uiPriority="33" w:unhideWhenUsed="0" w:qFormat="1"/>
+    <w:lsdException w:name="Bibliography" w:uiPriority="37"/>
+    <w:lsdException w:name="TOC Heading" w:uiPriority="39" w:qFormat="1"/>
+  </w:latentStyles>
+  <w:style w:type="paragraph" w:default="1" w:styleId="Normal">
+    <w:name w:val="Normal"/>
+    <w:qFormat/>
+    <w:rsid w:val="008968E1"/>
+    <w:rPr>
+      <w:rFonts w:ascii="Courier New" w:eastAsia="Times New Roman" w:hAnsi="Courier New" w:cs="Times New Roman"/>
+      <w:kern w:val="0"/>
+      <w:szCs w:val="20"/>
+      <w:lang w:val="en-US"/>
+      <w14:ligatures w14:val="none"/>
+    </w:rPr>
+  </w:style>
+  <w:style w:type="character" w:default="1" w:styleId="DefaultParagraphFont">
+    <w:name w:val="Default Paragraph Font"/>
+    <w:uiPriority w:val="1"/>
+    <w:semiHidden/>
+    <w:unhideWhenUsed/>
+  </w:style>
+  <w:style w:type="table" w:default="1" w:styleId="TableNormal">
+    <w:name w:val="Normal Table"/>
+    <w:uiPriority w:val="99"/>
+    <w:semiHidden/>
+    <w:unhideWhenUsed/>
+    <w:tblPr>
+      <w:tblInd w:w="0" w:type="dxa"/>
+      <w:tblCellMar>
+        <w:top w:w="0" w:type="dxa"/>
+        <w:left w:w="108" w:type="dxa"/>
+        <w:bottom w:w="0" w:type="dxa"/>
+        <w:right w:w="108" w:type="dxa"/>
+      </w:tblCellMar>
+    </w:tblPr>
+  </w:style>
+  <w:style w:type="numbering" w:default="1" w:styleId="NoList">
+    <w:name w:val="No List"/>
+    <w:uiPriority w:val="99"/>
+    <w:semiHidden/>
+    <w:unhideWhenUsed/>
+  </w:style>
+  <w:style w:type="paragraph" w:styleId="BodyText3">
+    <w:name w:val="Body Text 3"/>
+    <w:basedOn w:val="Normal"/>
+    <w:link w:val="BodyText3Char"/>
+    <w:rsid w:val="00CC6BEC"/>
+    <w:pPr>
+      <w:ind w:right="270"/>
+      <w:jc w:val="both"/>
+    </w:pPr>
+    <w:rPr>
+      <w:b/>
+    </w:rPr>
+  </w:style>
+  <w:style w:type="character" w:customStyle="1" w:styleId="BodyText3Char">
+    <w:name w:val="Body Text 3 Char"/>
+    <w:basedOn w:val="DefaultParagraphFont"/>
+    <w:link w:val="BodyText3"/>
+    <w:rsid w:val="00CC6BEC"/>
+    <w:rPr>
+      <w:rFonts w:ascii="Courier New" w:eastAsia="Times New Roman" w:hAnsi="Courier New" w:cs="Times New Roman"/>
+      <w:b/>
+      <w:kern w:val="0"/>
+      <w:szCs w:val="20"/>
+      <w:lang w:val="en-US"/>
+      <w14:ligatures w14:val="none"/>
+    </w:rPr>
+  </w:style>
+  <w:style w:type="paragraph" w:styleId="BodyText">
+    <w:name w:val="Body Text"/>
+    <w:basedOn w:val="Normal"/>
+    <w:link w:val="BodyTextChar"/>
+    <w:rsid w:val="00CC6BEC"/>
+    <w:pPr>
+      <w:jc w:val="both"/>
+    </w:pPr>
+    <w:rPr>
+      <w:b/>
+      <w:sz w:val="26"/>
+    </w:rPr>
+  </w:style>
+  <w:style w:type="character" w:customStyle="1" w:styleId="BodyTextChar">
+    <w:name w:val="Body Text Char"/>
+    <w:basedOn w:val="DefaultParagraphFont"/>
+    <w:link w:val="BodyText"/>
+    <w:rsid w:val="00CC6BEC"/>
+    <w:rPr>
+      <w:rFonts w:ascii="Courier New" w:eastAsia="Times New Roman" w:hAnsi="Courier New" w:cs="Times New Roman"/>
+      <w:b/>
+      <w:kern w:val="0"/>
+      <w:sz w:val="26"/>
+      <w:szCs w:val="20"/>
+      <w:lang w:val="en-US"/>
+      <w14:ligatures w14:val="none"/>
+    </w:rPr>
+  </w:style>
+  <w:style w:type="paragraph" w:styleId="ListParagraph">
+    <w:name w:val="List Paragraph"/>
+    <w:basedOn w:val="Normal"/>
+    <w:uiPriority w:val="34"/>
+    <w:qFormat/>
+    <w:rsid w:val="00CC6BEC"/>
+    <w:pPr>
+      <w:spacing w:after="200" w:line="276" w:lineRule="auto"/>
+      <w:ind w:left="720"/>
+      <w:contextualSpacing/>
+    </w:pPr>
+    <w:rPr>
+      <w:rFonts w:ascii="Calibri" w:eastAsia="Calibri" w:hAnsi="Calibri"/>
+      <w:sz w:val="22"/>
+      <w:szCs w:val="22"/>
+    </w:rPr>
+  </w:style>
+  <w:style w:type="paragraph" w:styleId="Header">
+    <w:name w:val="header"/>
+    <w:basedOn w:val="Normal"/>
+    <w:link w:val="HeaderChar"/>
+    <w:uiPriority w:val="99"/>
+    <w:unhideWhenUsed/>
+    <w:rsid w:val="00CC6BEC"/>
+    <w:pPr>
+      <w:tabs>
+        <w:tab w:val="center" w:pos="4680"/>
+        <w:tab w:val="right" w:pos="9360"/>
+      </w:tabs>
+    </w:pPr>
+  </w:style>
+  <w:style w:type="character" w:customStyle="1" w:styleId="HeaderChar">
+    <w:name w:val="Header Char"/>
+    <w:basedOn w:val="DefaultParagraphFont"/>
+    <w:link w:val="Header"/>
+    <w:uiPriority w:val="99"/>
+    <w:rsid w:val="00CC6BEC"/>
+    <w:rPr>
+      <w:rFonts w:ascii="Courier New" w:eastAsia="Times New Roman" w:hAnsi="Courier New" w:cs="Times New Roman"/>
+      <w:kern w:val="0"/>
+      <w:szCs w:val="20"/>
+      <w:lang w:val="en-US"/>
+      <w14:ligatures w14:val="none"/>
+    </w:rPr>
+  </w:style>
+  <w:style w:type="paragraph" w:styleId="Title">
+    <w:name w:val="Title"/>
+    <w:basedOn w:val="Normal"/>
+    <w:link w:val="TitleChar"/>
+    <w:qFormat/>
+    <w:rsid w:val="00CC6BEC"/>
+    <w:pPr>
+      <w:jc w:val="center"/>
+    </w:pPr>
+    <w:rPr>
+      <w:rFonts w:ascii="Arial" w:hAnsi="Arial" w:cs="Arial"/>
+      <w:szCs w:val="24"/>
+      <w:u w:val="single"/>
+    </w:rPr>
+  </w:style>
+  <w:style w:type="character" w:customStyle="1" w:styleId="TitleChar">
+    <w:name w:val="Title Char"/>
+    <w:basedOn w:val="DefaultParagraphFont"/>
+    <w:link w:val="Title"/>
+    <w:rsid w:val="00CC6BEC"/>
+    <w:rPr>
+      <w:rFonts w:ascii="Arial" w:eastAsia="Times New Roman" w:hAnsi="Arial" w:cs="Arial"/>
+      <w:kern w:val="0"/>
+      <w:u w:val="single"/>
+      <w:lang w:val="en-US"/>
+      <w14:ligatures w14:val="none"/>
+    </w:rPr>
+  </w:style>
+  <w:style w:type="table" w:styleId="TableGrid">
+    <w:name w:val="Table Grid"/>
+    <w:basedOn w:val="TableNormal"/>
+    <w:uiPriority w:val="59"/>
+    <w:rsid w:val="00CC6BEC"/>
+    <w:rPr>
+      <w:kern w:val="0"/>
+      <w:sz w:val="22"/>
+      <w:szCs w:val="22"/>
+      <w14:ligatures w14:val="none"/>
+    </w:rPr>
+    <w:tblPr>
+      <w:tblInd w:w="0" w:type="dxa"/>
+      <w:tblBorders>
+        <w:top w:val="single" w:sz="4" w:space="0" w:color="auto"/>
+        <w:left w:val="single" w:sz="4" w:space="0" w:color="auto"/>
+        <w:bottom w:val="single" w:sz="4" w:space="0" w:color="auto"/>
+        <w:right w:val="single" w:sz="4" w:space="0" w:color="auto"/>
+        <w:insideH w:val="single" w:sz="4" w:space="0" w:color="auto"/>
+        <w:insideV w:val="single" w:sz="4" w:space="0" w:color="auto"/>
+      </w:tblBorders>
+      <w:tblCellMar>
+        <w:top w:w="0" w:type="dxa"/>
+        <w:left w:w="108" w:type="dxa"/>
+        <w:bottom w:w="0" w:type="dxa"/>
+        <w:right w:w="108" w:type="dxa"/>
+      </w:tblCellMar>
     </w:tblPr>
   </w:style>
 </w:styles>
@@ -11249,7 +11302,7 @@
   <a:extraClrSchemeLst/>
   <a:extLst>
     <a:ext uri="{05A4C25C-085E-4340-85A3-A5531E510DB2}">
-      <thm15:themeFamily xmlns:thm15="http://schemas.microsoft.com/office/thememl/2012/main" name="Office Theme" id="{62F939B6-93AF-4DB8-9C6B-D6C7DFDC589F}" vid="{4A3C46E8-61CC-4603-A589-7422A47A8E4A}"/>
+      <thm15:themeFamily xmlns:thm15="http://schemas.microsoft.com/office/thememl/2012/main" xmlns="" name="Office Theme" id="{62F939B6-93AF-4DB8-9C6B-D6C7DFDC589F}" vid="{4A3C46E8-61CC-4603-A589-7422A47A8E4A}"/>
     </a:ext>
   </a:extLst>
 </a:theme>

</xml_diff>